<commit_message>
Add missing sentence to sealing template
</commit_message>
<xml_diff>
--- a/Expungement-Generator/templates/791SealingTemplate.docx
+++ b/Expungement-Generator/templates/791SealingTemplate.docx
@@ -1,6 +1,6 @@
 
 <file path=word/document.xml><?xml version="1.0" encoding="utf-8"?>
-<w:document xmlns:o="urn:schemas-microsoft-com:office:office" xmlns:r="http://schemas.openxmlformats.org/officeDocument/2006/relationships" xmlns:v="urn:schemas-microsoft-com:vml" xmlns:w="http://schemas.openxmlformats.org/wordprocessingml/2006/main" xmlns:w10="urn:schemas-microsoft-com:office:word" xmlns:wp="http://schemas.openxmlformats.org/drawingml/2006/wordprocessingDrawing" xmlns:wps="http://schemas.microsoft.com/office/word/2010/wordprocessingShape" xmlns:wpg="http://schemas.microsoft.com/office/word/2010/wordprocessingGroup" xmlns:mc="http://schemas.openxmlformats.org/markup-compatibility/2006" xmlns:wp14="http://schemas.microsoft.com/office/word/2010/wordprocessingDrawing" xmlns:w14="http://schemas.microsoft.com/office/word/2010/wordml" mc:Ignorable="w14 wp14">
+<w:document xmlns:o="urn:schemas-microsoft-com:office:office" xmlns:r="http://schemas.openxmlformats.org/officeDocument/2006/relationships" xmlns:v="urn:schemas-microsoft-com:vml" xmlns:w="http://schemas.openxmlformats.org/wordprocessingml/2006/main" xmlns:w10="urn:schemas-microsoft-com:office:word" xmlns:wp="http://schemas.openxmlformats.org/drawingml/2006/wordprocessingDrawing" xmlns:wps="http://schemas.microsoft.com/office/word/2010/wordprocessingShape" xmlns:wpg="http://schemas.microsoft.com/office/word/2010/wordprocessingGroup" xmlns:mc="http://schemas.openxmlformats.org/markup-compatibility/2006" xmlns:wp14="http://schemas.microsoft.com/office/word/2010/wordprocessingDrawing" xmlns:w14="http://schemas.microsoft.com/office/word/2010/wordml" xmlns:w15="http://schemas.microsoft.com/office/word/2012/wordml" mc:Ignorable="w14 wp14 w15">
   <w:body>
     <w:p>
       <w:pPr>
@@ -118,18 +118,19 @@
         <w:tblW w:w="9650" w:type="dxa"/>
         <w:jc w:val="left"/>
         <w:tblInd w:w="0" w:type="dxa"/>
+        <w:tblLayout w:type="fixed"/>
         <w:tblCellMar>
           <w:top w:w="0" w:type="dxa"/>
           <w:left w:w="115" w:type="dxa"/>
           <w:bottom w:w="0" w:type="dxa"/>
           <w:right w:w="115" w:type="dxa"/>
         </w:tblCellMar>
-        <w:tblLook w:lastRow="0" w:firstRow="1" w:lastColumn="0" w:firstColumn="1" w:val="04a0" w:noHBand="0" w:noVBand="1"/>
+        <w:tblLook w:val="04a0" w:noVBand="1" w:noHBand="0" w:lastColumn="0" w:firstColumn="1" w:lastRow="0" w:firstRow="1"/>
       </w:tblPr>
       <w:tblGrid>
         <w:gridCol w:w="5065"/>
-        <w:gridCol w:w="422"/>
-        <w:gridCol w:w="4163"/>
+        <w:gridCol w:w="421"/>
+        <w:gridCol w:w="4164"/>
       </w:tblGrid>
       <w:tr>
         <w:trPr/>
@@ -141,8 +142,6 @@
               <w:left w:val="nil"/>
               <w:bottom w:val="nil"/>
               <w:right w:val="nil"/>
-              <w:insideH w:val="nil"/>
-              <w:insideV w:val="nil"/>
             </w:tcBorders>
             <w:shd w:fill="auto" w:val="clear"/>
           </w:tcPr>
@@ -163,14 +162,12 @@
         </w:tc>
         <w:tc>
           <w:tcPr>
-            <w:tcW w:w="422" w:type="dxa"/>
+            <w:tcW w:w="421" w:type="dxa"/>
             <w:tcBorders>
               <w:top w:val="nil"/>
               <w:left w:val="nil"/>
               <w:bottom w:val="nil"/>
               <w:right w:val="nil"/>
-              <w:insideH w:val="nil"/>
-              <w:insideV w:val="nil"/>
             </w:tcBorders>
             <w:shd w:fill="auto" w:val="clear"/>
           </w:tcPr>
@@ -184,7 +181,7 @@
                 <w:tab w:val="left" w:pos="5490" w:leader="none"/>
               </w:tabs>
               <w:spacing w:lineRule="auto" w:line="240" w:before="0" w:after="0"/>
-              <w:ind w:left="-25" w:hanging="0"/>
+              <w:ind w:hanging="0" w:left="-25"/>
               <w:rPr/>
             </w:pPr>
             <w:r>
@@ -195,14 +192,12 @@
         </w:tc>
         <w:tc>
           <w:tcPr>
-            <w:tcW w:w="4163" w:type="dxa"/>
+            <w:tcW w:w="4164" w:type="dxa"/>
             <w:tcBorders>
               <w:top w:val="nil"/>
               <w:left w:val="nil"/>
               <w:bottom w:val="nil"/>
               <w:right w:val="nil"/>
-              <w:insideH w:val="nil"/>
-              <w:insideV w:val="nil"/>
             </w:tcBorders>
             <w:shd w:fill="auto" w:val="clear"/>
           </w:tcPr>
@@ -314,7 +309,6 @@
         <w:rPr>
           <w:rFonts w:cs="Arial"/>
           <w:b/>
-          <w:b/>
           <w:sz w:val="24"/>
           <w:szCs w:val="24"/>
         </w:rPr>
@@ -336,7 +330,6 @@
         <w:jc w:val="center"/>
         <w:rPr>
           <w:rFonts w:cs="Arial"/>
-          <w:b/>
           <w:b/>
           <w:sz w:val="24"/>
           <w:szCs w:val="24"/>
@@ -367,7 +360,7 @@
           <w:tab w:val="left" w:pos="9720" w:leader="none"/>
         </w:tabs>
         <w:spacing w:lineRule="auto" w:line="240" w:before="0" w:after="0"/>
-        <w:ind w:right="360" w:hanging="0"/>
+        <w:ind w:hanging="0" w:right="360"/>
         <w:jc w:val="center"/>
         <w:rPr>
           <w:rFonts w:cs="Arial"/>
@@ -479,6 +472,41 @@
           <w:szCs w:val="24"/>
         </w:rPr>
         <w:t>This case qualifies for a limited access order and none of the exceptions under 18 Pa.C.S. § 9122.1(b) are applicable</w:t>
+      </w:r>
+    </w:p>
+    <w:p>
+      <w:pPr>
+        <w:pStyle w:val="Normal"/>
+        <w:spacing w:lineRule="auto" w:line="240" w:before="0" w:after="0"/>
+        <w:jc w:val="both"/>
+        <w:rPr>
+          <w:rFonts w:cs="Arial"/>
+          <w:sz w:val="24"/>
+          <w:szCs w:val="24"/>
+        </w:rPr>
+      </w:pPr>
+      <w:r>
+        <w:rPr/>
+      </w:r>
+    </w:p>
+    <w:p>
+      <w:pPr>
+        <w:pStyle w:val="Normal"/>
+        <w:spacing w:lineRule="auto" w:line="240" w:before="0" w:after="0"/>
+        <w:jc w:val="both"/>
+        <w:rPr>
+          <w:rFonts w:cs="Arial"/>
+          <w:sz w:val="24"/>
+          <w:szCs w:val="24"/>
+        </w:rPr>
+      </w:pPr>
+      <w:r>
+        <w:rPr>
+          <w:rFonts w:cs="Arial"/>
+          <w:sz w:val="24"/>
+          <w:szCs w:val="24"/>
+        </w:rPr>
+        <w:t>The information required under Pa.R.Crim.P. 791 appears on the attached page(s) which is hereby incorporated into this ORDER by reference.</w:t>
       </w:r>
     </w:p>
     <w:p>
@@ -515,7 +543,7 @@
           <w:tab w:val="left" w:pos="9720" w:leader="none"/>
         </w:tabs>
         <w:spacing w:lineRule="auto" w:line="240" w:before="0" w:after="0"/>
-        <w:ind w:right="360" w:hanging="0"/>
+        <w:ind w:hanging="0" w:right="360"/>
         <w:rPr>
           <w:rFonts w:cs="Arial"/>
           <w:sz w:val="24"/>
@@ -548,7 +576,7 @@
           <w:tab w:val="left" w:pos="9720" w:leader="none"/>
         </w:tabs>
         <w:spacing w:lineRule="auto" w:line="240" w:before="0" w:after="0"/>
-        <w:ind w:right="360" w:hanging="0"/>
+        <w:ind w:hanging="0" w:right="360"/>
         <w:rPr>
           <w:rFonts w:cs="Arial"/>
           <w:sz w:val="24"/>
@@ -578,7 +606,7 @@
           <w:tab w:val="left" w:pos="9720" w:leader="none"/>
         </w:tabs>
         <w:spacing w:lineRule="auto" w:line="240" w:before="0" w:after="0"/>
-        <w:ind w:right="360" w:hanging="0"/>
+        <w:ind w:hanging="0" w:right="360"/>
         <w:rPr>
           <w:rFonts w:cs="Arial"/>
           <w:sz w:val="24"/>
@@ -600,7 +628,7 @@
       <w:pPr>
         <w:pStyle w:val="Normal"/>
         <w:spacing w:lineRule="auto" w:line="240" w:before="0" w:after="0"/>
-        <w:ind w:left="7200" w:firstLine="720"/>
+        <w:ind w:firstLine="720" w:left="7200"/>
         <w:rPr>
           <w:rFonts w:cs="Arial"/>
         </w:rPr>
@@ -706,7 +734,7 @@
       <w:pPr>
         <w:pStyle w:val="ListParagraph"/>
         <w:spacing w:lineRule="auto" w:line="240" w:before="0" w:after="0"/>
-        <w:ind w:left="360" w:hanging="0"/>
+        <w:ind w:hanging="0" w:left="360"/>
         <w:jc w:val="both"/>
         <w:rPr>
           <w:rFonts w:cs="Arial"/>
@@ -796,7 +824,7 @@
         <w:pStyle w:val="ListParagraph"/>
         <w:widowControl w:val="false"/>
         <w:spacing w:lineRule="auto" w:line="240" w:before="0" w:after="0"/>
-        <w:ind w:left="360" w:right="-20" w:hanging="0"/>
+        <w:ind w:hanging="0" w:left="360" w:right="-20"/>
         <w:rPr>
           <w:rFonts w:cs="Arial"/>
         </w:rPr>
@@ -813,7 +841,7 @@
         <w:pStyle w:val="ListParagraph"/>
         <w:widowControl w:val="false"/>
         <w:spacing w:lineRule="auto" w:line="240" w:before="0" w:after="0"/>
-        <w:ind w:left="360" w:right="-20" w:hanging="0"/>
+        <w:ind w:hanging="0" w:left="360" w:right="-20"/>
         <w:rPr>
           <w:rFonts w:cs="Arial"/>
         </w:rPr>
@@ -829,7 +857,7 @@
       <w:pPr>
         <w:pStyle w:val="ListParagraph"/>
         <w:spacing w:lineRule="auto" w:line="240" w:before="0" w:after="0"/>
-        <w:ind w:left="360" w:hanging="0"/>
+        <w:ind w:hanging="0" w:left="360"/>
         <w:rPr>
           <w:rFonts w:cs="Arial"/>
         </w:rPr>
@@ -873,11 +901,10 @@
       <w:pPr>
         <w:pStyle w:val="ListParagraph"/>
         <w:spacing w:lineRule="auto" w:line="240" w:before="0" w:after="0"/>
-        <w:ind w:left="360" w:hanging="0"/>
+        <w:ind w:hanging="0" w:left="360"/>
         <w:jc w:val="both"/>
         <w:rPr>
           <w:rFonts w:cs="Arial"/>
-          <w:b/>
           <w:b/>
           <w:sz w:val="24"/>
           <w:szCs w:val="24"/>
@@ -944,7 +971,6 @@
         <w:rPr>
           <w:rFonts w:cs="Arial"/>
           <w:b/>
-          <w:b/>
           <w:sz w:val="24"/>
           <w:szCs w:val="24"/>
         </w:rPr>
@@ -964,7 +990,7 @@
         <w:pStyle w:val="ListParagraph"/>
         <w:widowControl w:val="false"/>
         <w:spacing w:lineRule="auto" w:line="240" w:before="0" w:after="0"/>
-        <w:ind w:left="360" w:right="-20" w:hanging="0"/>
+        <w:ind w:hanging="0" w:left="360" w:right="-20"/>
         <w:rPr/>
       </w:pPr>
       <w:r>
@@ -978,7 +1004,7 @@
       <w:pPr>
         <w:pStyle w:val="ListParagraph"/>
         <w:spacing w:lineRule="auto" w:line="240" w:before="0" w:after="0"/>
-        <w:ind w:left="360" w:hanging="0"/>
+        <w:ind w:hanging="0" w:left="360"/>
         <w:rPr/>
       </w:pPr>
       <w:r>
@@ -990,7 +1016,7 @@
       <w:pPr>
         <w:pStyle w:val="ListParagraph"/>
         <w:spacing w:lineRule="auto" w:line="240" w:before="0" w:after="0"/>
-        <w:ind w:left="360" w:hanging="0"/>
+        <w:ind w:hanging="0" w:left="360"/>
         <w:rPr/>
       </w:pPr>
       <w:r>
@@ -1009,7 +1035,6 @@
         <w:rPr>
           <w:rFonts w:cs="Arial"/>
           <w:b/>
-          <w:b/>
           <w:sz w:val="24"/>
           <w:szCs w:val="24"/>
         </w:rPr>
@@ -1028,7 +1053,7 @@
       <w:pPr>
         <w:pStyle w:val="ListParagraph"/>
         <w:spacing w:lineRule="auto" w:line="240" w:before="0" w:after="0"/>
-        <w:ind w:left="360" w:hanging="0"/>
+        <w:ind w:hanging="0" w:left="360"/>
         <w:jc w:val="both"/>
         <w:rPr>
           <w:rFonts w:cs="Arial"/>
@@ -1049,7 +1074,7 @@
       <w:pPr>
         <w:pStyle w:val="ListParagraph"/>
         <w:spacing w:lineRule="auto" w:line="240" w:before="0" w:after="0"/>
-        <w:ind w:left="360" w:hanging="0"/>
+        <w:ind w:hanging="0" w:left="360"/>
         <w:jc w:val="both"/>
         <w:rPr>
           <w:rFonts w:cs="Arial"/>
@@ -1077,7 +1102,6 @@
         <w:rPr>
           <w:rFonts w:cs="Arial"/>
           <w:b/>
-          <w:b/>
           <w:sz w:val="24"/>
           <w:szCs w:val="24"/>
         </w:rPr>
@@ -1098,13 +1122,14 @@
         <w:tblW w:w="9350" w:type="dxa"/>
         <w:jc w:val="left"/>
         <w:tblInd w:w="378" w:type="dxa"/>
+        <w:tblLayout w:type="fixed"/>
         <w:tblCellMar>
           <w:top w:w="0" w:type="dxa"/>
           <w:left w:w="108" w:type="dxa"/>
           <w:bottom w:w="0" w:type="dxa"/>
           <w:right w:w="108" w:type="dxa"/>
         </w:tblCellMar>
-        <w:tblLook w:noVBand="1" w:val="04a0" w:noHBand="0" w:lastColumn="0" w:firstColumn="1" w:lastRow="0" w:firstRow="1"/>
+        <w:tblLook w:val="04a0" w:noVBand="1" w:noHBand="0" w:lastColumn="0" w:firstColumn="1" w:lastRow="0" w:firstRow="1"/>
       </w:tblPr>
       <w:tblGrid>
         <w:gridCol w:w="9350"/>
@@ -1119,8 +1144,6 @@
               <w:left w:val="nil"/>
               <w:bottom w:val="nil"/>
               <w:right w:val="nil"/>
-              <w:insideH w:val="nil"/>
-              <w:insideV w:val="nil"/>
             </w:tcBorders>
             <w:shd w:fill="auto" w:val="clear"/>
           </w:tcPr>
@@ -1129,7 +1152,7 @@
               <w:pStyle w:val="ListParagraph"/>
               <w:widowControl w:val="false"/>
               <w:spacing w:lineRule="exact" w:line="206" w:before="0" w:after="0"/>
-              <w:ind w:left="-18" w:right="-20" w:hanging="0"/>
+              <w:ind w:hanging="0" w:left="-18" w:right="-20"/>
               <w:rPr>
                 <w:rFonts w:cs="Arial"/>
               </w:rPr>
@@ -1147,7 +1170,7 @@
         <w:pStyle w:val="ListParagraph"/>
         <w:widowControl w:val="false"/>
         <w:spacing w:lineRule="exact" w:line="206" w:before="0" w:after="0"/>
-        <w:ind w:left="360" w:right="-20" w:hanging="0"/>
+        <w:ind w:hanging="0" w:left="360" w:right="-20"/>
         <w:rPr/>
       </w:pPr>
       <w:r>
@@ -1187,7 +1210,7 @@
       <w:pPr>
         <w:pStyle w:val="ListParagraph"/>
         <w:spacing w:lineRule="auto" w:line="240" w:before="0" w:after="0"/>
-        <w:ind w:left="360" w:hanging="0"/>
+        <w:ind w:hanging="0" w:left="360"/>
         <w:jc w:val="both"/>
         <w:rPr>
           <w:rFonts w:cs="Arial"/>
@@ -1269,28 +1292,21 @@
         <w:tblW w:w="10779" w:type="dxa"/>
         <w:jc w:val="left"/>
         <w:tblInd w:w="-591" w:type="dxa"/>
-        <w:tblBorders>
-          <w:top w:val="single" w:sz="4" w:space="0" w:color="000000"/>
-          <w:left w:val="single" w:sz="4" w:space="0" w:color="000000"/>
-          <w:bottom w:val="single" w:sz="4" w:space="0" w:color="000000"/>
-          <w:right w:val="single" w:sz="4" w:space="0" w:color="000000"/>
-          <w:insideH w:val="single" w:sz="4" w:space="0" w:color="000000"/>
-          <w:insideV w:val="single" w:sz="4" w:space="0" w:color="000000"/>
-        </w:tblBorders>
+        <w:tblLayout w:type="fixed"/>
         <w:tblCellMar>
           <w:top w:w="0" w:type="dxa"/>
           <w:left w:w="14" w:type="dxa"/>
           <w:bottom w:w="14" w:type="dxa"/>
           <w:right w:w="14" w:type="dxa"/>
         </w:tblCellMar>
-        <w:tblLook w:noVBand="0" w:val="0000" w:noHBand="0" w:lastColumn="0" w:firstColumn="0" w:lastRow="0" w:firstRow="0"/>
+        <w:tblLook w:val="0000" w:noVBand="0" w:noHBand="0" w:lastColumn="0" w:firstColumn="0" w:lastRow="0" w:firstRow="0"/>
       </w:tblPr>
       <w:tblGrid>
         <w:gridCol w:w="2049"/>
-        <w:gridCol w:w="2969"/>
-        <w:gridCol w:w="811"/>
-        <w:gridCol w:w="1529"/>
-        <w:gridCol w:w="3421"/>
+        <w:gridCol w:w="2968"/>
+        <w:gridCol w:w="812"/>
+        <w:gridCol w:w="1528"/>
+        <w:gridCol w:w="3422"/>
       </w:tblGrid>
       <w:tr>
         <w:trPr/>
@@ -1302,8 +1318,6 @@
               <w:left w:val="single" w:sz="4" w:space="0" w:color="000000"/>
               <w:bottom w:val="single" w:sz="4" w:space="0" w:color="000000"/>
               <w:right w:val="single" w:sz="4" w:space="0" w:color="000000"/>
-              <w:insideH w:val="single" w:sz="4" w:space="0" w:color="000000"/>
-              <w:insideV w:val="single" w:sz="4" w:space="0" w:color="000000"/>
             </w:tcBorders>
             <w:shd w:fill="auto" w:val="clear"/>
           </w:tcPr>
@@ -1312,7 +1326,7 @@
               <w:pStyle w:val="Normal"/>
               <w:widowControl w:val="false"/>
               <w:spacing w:lineRule="auto" w:line="240" w:before="1" w:after="0"/>
-              <w:ind w:left="102" w:right="-20" w:hanging="0"/>
+              <w:ind w:hanging="0" w:left="102" w:right="-20"/>
               <w:rPr/>
             </w:pPr>
             <w:r>
@@ -1327,14 +1341,12 @@
         </w:tc>
         <w:tc>
           <w:tcPr>
-            <w:tcW w:w="2969" w:type="dxa"/>
+            <w:tcW w:w="2968" w:type="dxa"/>
             <w:tcBorders>
               <w:top w:val="single" w:sz="4" w:space="0" w:color="000000"/>
               <w:left w:val="single" w:sz="4" w:space="0" w:color="000000"/>
               <w:bottom w:val="single" w:sz="4" w:space="0" w:color="000000"/>
               <w:right w:val="single" w:sz="4" w:space="0" w:color="000000"/>
-              <w:insideH w:val="single" w:sz="4" w:space="0" w:color="000000"/>
-              <w:insideV w:val="single" w:sz="4" w:space="0" w:color="000000"/>
             </w:tcBorders>
             <w:shd w:fill="auto" w:val="clear"/>
           </w:tcPr>
@@ -1343,7 +1355,7 @@
               <w:pStyle w:val="Normal"/>
               <w:widowControl w:val="false"/>
               <w:spacing w:lineRule="auto" w:line="240" w:before="0" w:after="0"/>
-              <w:ind w:left="102" w:right="-20" w:hanging="0"/>
+              <w:ind w:hanging="0" w:left="102" w:right="-20"/>
               <w:rPr/>
             </w:pPr>
             <w:r>
@@ -1466,14 +1478,12 @@
         </w:tc>
         <w:tc>
           <w:tcPr>
-            <w:tcW w:w="811" w:type="dxa"/>
+            <w:tcW w:w="812" w:type="dxa"/>
             <w:tcBorders>
               <w:top w:val="single" w:sz="4" w:space="0" w:color="000000"/>
               <w:left w:val="single" w:sz="4" w:space="0" w:color="000000"/>
               <w:bottom w:val="single" w:sz="4" w:space="0" w:color="000000"/>
               <w:right w:val="single" w:sz="4" w:space="0" w:color="000000"/>
-              <w:insideH w:val="single" w:sz="4" w:space="0" w:color="000000"/>
-              <w:insideV w:val="single" w:sz="4" w:space="0" w:color="000000"/>
             </w:tcBorders>
             <w:shd w:fill="auto" w:val="clear"/>
           </w:tcPr>
@@ -1482,7 +1492,7 @@
               <w:pStyle w:val="Normal"/>
               <w:widowControl w:val="false"/>
               <w:spacing w:lineRule="auto" w:line="240" w:before="0" w:after="0"/>
-              <w:ind w:left="100" w:right="-20" w:hanging="0"/>
+              <w:ind w:hanging="0" w:left="100" w:right="-20"/>
               <w:jc w:val="both"/>
               <w:rPr/>
             </w:pPr>
@@ -1512,14 +1522,12 @@
         </w:tc>
         <w:tc>
           <w:tcPr>
-            <w:tcW w:w="1529" w:type="dxa"/>
+            <w:tcW w:w="1528" w:type="dxa"/>
             <w:tcBorders>
               <w:top w:val="single" w:sz="4" w:space="0" w:color="000000"/>
               <w:left w:val="single" w:sz="4" w:space="0" w:color="000000"/>
               <w:bottom w:val="single" w:sz="4" w:space="0" w:color="000000"/>
               <w:right w:val="single" w:sz="4" w:space="0" w:color="000000"/>
-              <w:insideH w:val="single" w:sz="4" w:space="0" w:color="000000"/>
-              <w:insideV w:val="single" w:sz="4" w:space="0" w:color="000000"/>
             </w:tcBorders>
             <w:shd w:fill="auto" w:val="clear"/>
           </w:tcPr>
@@ -1528,10 +1536,9 @@
               <w:pStyle w:val="Normal"/>
               <w:widowControl w:val="false"/>
               <w:spacing w:lineRule="auto" w:line="240" w:before="0" w:after="0"/>
-              <w:ind w:left="100" w:right="-20" w:hanging="0"/>
+              <w:ind w:hanging="0" w:left="100" w:right="-20"/>
               <w:jc w:val="both"/>
               <w:rPr>
-                <w:b/>
                 <w:b/>
               </w:rPr>
             </w:pPr>
@@ -1545,14 +1552,12 @@
         </w:tc>
         <w:tc>
           <w:tcPr>
-            <w:tcW w:w="3421" w:type="dxa"/>
+            <w:tcW w:w="3422" w:type="dxa"/>
             <w:tcBorders>
               <w:top w:val="single" w:sz="4" w:space="0" w:color="000000"/>
               <w:left w:val="single" w:sz="4" w:space="0" w:color="000000"/>
               <w:bottom w:val="single" w:sz="4" w:space="0" w:color="000000"/>
               <w:right w:val="single" w:sz="4" w:space="0" w:color="000000"/>
-              <w:insideH w:val="single" w:sz="4" w:space="0" w:color="000000"/>
-              <w:insideV w:val="single" w:sz="4" w:space="0" w:color="000000"/>
             </w:tcBorders>
             <w:shd w:fill="auto" w:val="clear"/>
           </w:tcPr>
@@ -1561,7 +1566,7 @@
               <w:pStyle w:val="Normal"/>
               <w:widowControl w:val="false"/>
               <w:spacing w:lineRule="auto" w:line="240" w:before="0" w:after="0"/>
-              <w:ind w:left="100" w:right="-20" w:hanging="0"/>
+              <w:ind w:hanging="0" w:left="100" w:right="-20"/>
               <w:rPr/>
             </w:pPr>
             <w:r>
@@ -1641,8 +1646,6 @@
               <w:left w:val="single" w:sz="4" w:space="0" w:color="000000"/>
               <w:bottom w:val="single" w:sz="4" w:space="0" w:color="000000"/>
               <w:right w:val="single" w:sz="4" w:space="0" w:color="000000"/>
-              <w:insideH w:val="single" w:sz="4" w:space="0" w:color="000000"/>
-              <w:insideV w:val="single" w:sz="4" w:space="0" w:color="000000"/>
             </w:tcBorders>
             <w:shd w:fill="auto" w:val="clear"/>
           </w:tcPr>
@@ -1651,7 +1654,7 @@
               <w:pStyle w:val="Normal"/>
               <w:widowControl w:val="false"/>
               <w:spacing w:lineRule="auto" w:line="240" w:before="0" w:after="0"/>
-              <w:ind w:left="100" w:right="-20" w:hanging="0"/>
+              <w:ind w:hanging="0" w:left="100" w:right="-20"/>
               <w:rPr>
                 <w:rFonts w:cs="Arial"/>
               </w:rPr>
@@ -1666,14 +1669,12 @@
         </w:tc>
         <w:tc>
           <w:tcPr>
-            <w:tcW w:w="2969" w:type="dxa"/>
+            <w:tcW w:w="2968" w:type="dxa"/>
             <w:tcBorders>
               <w:top w:val="single" w:sz="4" w:space="0" w:color="000000"/>
               <w:left w:val="single" w:sz="4" w:space="0" w:color="000000"/>
               <w:bottom w:val="single" w:sz="4" w:space="0" w:color="000000"/>
               <w:right w:val="single" w:sz="4" w:space="0" w:color="000000"/>
-              <w:insideH w:val="single" w:sz="4" w:space="0" w:color="000000"/>
-              <w:insideV w:val="single" w:sz="4" w:space="0" w:color="000000"/>
             </w:tcBorders>
             <w:shd w:fill="auto" w:val="clear"/>
           </w:tcPr>
@@ -1682,7 +1683,7 @@
               <w:pStyle w:val="Normal"/>
               <w:widowControl w:val="false"/>
               <w:spacing w:lineRule="auto" w:line="240" w:before="0" w:after="0"/>
-              <w:ind w:left="100" w:right="-20" w:hanging="0"/>
+              <w:ind w:hanging="0" w:left="100" w:right="-20"/>
               <w:rPr>
                 <w:rFonts w:cs="Arial"/>
               </w:rPr>
@@ -1697,14 +1698,12 @@
         </w:tc>
         <w:tc>
           <w:tcPr>
-            <w:tcW w:w="811" w:type="dxa"/>
+            <w:tcW w:w="812" w:type="dxa"/>
             <w:tcBorders>
               <w:top w:val="single" w:sz="4" w:space="0" w:color="000000"/>
               <w:left w:val="single" w:sz="4" w:space="0" w:color="000000"/>
               <w:bottom w:val="single" w:sz="4" w:space="0" w:color="000000"/>
               <w:right w:val="single" w:sz="4" w:space="0" w:color="000000"/>
-              <w:insideH w:val="single" w:sz="4" w:space="0" w:color="000000"/>
-              <w:insideV w:val="single" w:sz="4" w:space="0" w:color="000000"/>
             </w:tcBorders>
             <w:shd w:fill="auto" w:val="clear"/>
           </w:tcPr>
@@ -1713,7 +1712,7 @@
               <w:pStyle w:val="Normal"/>
               <w:widowControl w:val="false"/>
               <w:spacing w:lineRule="auto" w:line="240" w:before="0" w:after="0"/>
-              <w:ind w:left="100" w:right="-20" w:hanging="0"/>
+              <w:ind w:hanging="0" w:left="100" w:right="-20"/>
               <w:rPr>
                 <w:rFonts w:cs="Arial"/>
               </w:rPr>
@@ -1728,14 +1727,12 @@
         </w:tc>
         <w:tc>
           <w:tcPr>
-            <w:tcW w:w="1529" w:type="dxa"/>
+            <w:tcW w:w="1528" w:type="dxa"/>
             <w:tcBorders>
               <w:top w:val="single" w:sz="4" w:space="0" w:color="000000"/>
               <w:left w:val="single" w:sz="4" w:space="0" w:color="000000"/>
               <w:bottom w:val="single" w:sz="4" w:space="0" w:color="000000"/>
               <w:right w:val="single" w:sz="4" w:space="0" w:color="000000"/>
-              <w:insideH w:val="single" w:sz="4" w:space="0" w:color="000000"/>
-              <w:insideV w:val="single" w:sz="4" w:space="0" w:color="000000"/>
             </w:tcBorders>
             <w:shd w:fill="auto" w:val="clear"/>
           </w:tcPr>
@@ -1744,7 +1741,7 @@
               <w:pStyle w:val="Normal"/>
               <w:widowControl w:val="false"/>
               <w:spacing w:lineRule="auto" w:line="240" w:before="0" w:after="0"/>
-              <w:ind w:left="100" w:right="-20" w:hanging="0"/>
+              <w:ind w:hanging="0" w:left="100" w:right="-20"/>
               <w:rPr/>
             </w:pPr>
             <w:r>
@@ -1755,14 +1752,12 @@
         </w:tc>
         <w:tc>
           <w:tcPr>
-            <w:tcW w:w="3421" w:type="dxa"/>
+            <w:tcW w:w="3422" w:type="dxa"/>
             <w:tcBorders>
               <w:top w:val="single" w:sz="4" w:space="0" w:color="000000"/>
               <w:left w:val="single" w:sz="4" w:space="0" w:color="000000"/>
               <w:bottom w:val="single" w:sz="4" w:space="0" w:color="000000"/>
               <w:right w:val="single" w:sz="4" w:space="0" w:color="000000"/>
-              <w:insideH w:val="single" w:sz="4" w:space="0" w:color="000000"/>
-              <w:insideV w:val="single" w:sz="4" w:space="0" w:color="000000"/>
             </w:tcBorders>
             <w:shd w:fill="auto" w:val="clear"/>
           </w:tcPr>
@@ -1771,7 +1766,7 @@
               <w:pStyle w:val="Normal"/>
               <w:widowControl w:val="false"/>
               <w:spacing w:lineRule="auto" w:line="240" w:before="0" w:after="0"/>
-              <w:ind w:left="100" w:right="-20" w:hanging="0"/>
+              <w:ind w:hanging="0" w:left="100" w:right="-20"/>
               <w:rPr>
                 <w:rFonts w:cs="Arial"/>
               </w:rPr>
@@ -1793,7 +1788,6 @@
         <w:jc w:val="both"/>
         <w:rPr>
           <w:rFonts w:cs="Arial"/>
-          <w:b/>
           <w:b/>
           <w:sz w:val="24"/>
           <w:szCs w:val="24"/>
@@ -1820,7 +1814,6 @@
         <w:rPr>
           <w:rFonts w:cs="Arial"/>
           <w:b/>
-          <w:b/>
           <w:sz w:val="24"/>
           <w:szCs w:val="24"/>
         </w:rPr>
@@ -1840,7 +1833,7 @@
         <w:pStyle w:val="ListParagraph"/>
         <w:widowControl w:val="false"/>
         <w:spacing w:lineRule="auto" w:line="240" w:before="0" w:after="0"/>
-        <w:ind w:left="360" w:hanging="0"/>
+        <w:ind w:hanging="0" w:left="360"/>
         <w:rPr/>
       </w:pPr>
       <w:r>
@@ -1852,7 +1845,7 @@
       <w:pPr>
         <w:pStyle w:val="ListParagraph"/>
         <w:spacing w:lineRule="auto" w:line="240" w:before="0" w:after="0"/>
-        <w:ind w:left="360" w:hanging="0"/>
+        <w:ind w:hanging="0" w:left="360"/>
         <w:jc w:val="both"/>
         <w:rPr>
           <w:rFonts w:cs="Arial"/>
@@ -1880,7 +1873,6 @@
         <w:rPr>
           <w:rFonts w:cs="Arial"/>
           <w:b/>
-          <w:b/>
           <w:sz w:val="24"/>
           <w:szCs w:val="24"/>
         </w:rPr>
@@ -1899,26 +1891,14 @@
       <w:pPr>
         <w:pStyle w:val="Normal"/>
         <w:spacing w:lineRule="auto" w:line="240" w:before="0" w:after="0"/>
-        <w:ind w:left="360" w:hanging="0"/>
+        <w:ind w:hanging="0" w:left="360"/>
         <w:rPr/>
       </w:pPr>
       <w:bookmarkStart w:id="0" w:name="_GoBack"/>
       <w:bookmarkEnd w:id="0"/>
       <w:r>
         <w:rPr/>
-        <w:t xml:space="preserve">As a result of these convictions, Petitioner has been caused to suffer embarrassment and irreparable harm and loss of job opportunities. This case qualifies for a limited access order. </w:t>
-      </w:r>
-      <w:r>
-        <w:rPr/>
-        <w:t>N</w:t>
-      </w:r>
-      <w:r>
-        <w:rPr/>
-        <w:t xml:space="preserve">one of the exceptions under 18 Pa.C.S. 9122.1(b) are applicable, </w:t>
-      </w:r>
-      <w:r>
-        <w:rPr/>
-        <w:t>and no restitution is owed.</w:t>
+        <w:t>As a result of these convictions, Petitioner has been caused to suffer embarrassment and irreparable harm and loss of job opportunities. This case qualifies for a limited access order. None of the exceptions under 18 Pa.C.S. 9122.1(b) are applicable, and no restitution is owed.</w:t>
       </w:r>
     </w:p>
     <w:p>
@@ -1954,13 +1934,14 @@
         <w:tblW w:w="8820" w:type="dxa"/>
         <w:jc w:val="left"/>
         <w:tblInd w:w="378" w:type="dxa"/>
+        <w:tblLayout w:type="fixed"/>
         <w:tblCellMar>
           <w:top w:w="0" w:type="dxa"/>
           <w:left w:w="108" w:type="dxa"/>
           <w:bottom w:w="0" w:type="dxa"/>
           <w:right w:w="108" w:type="dxa"/>
         </w:tblCellMar>
-        <w:tblLook w:noVBand="1" w:val="04a0" w:noHBand="0" w:lastColumn="0" w:firstColumn="1" w:lastRow="0" w:firstRow="1"/>
+        <w:tblLook w:val="04a0" w:noVBand="1" w:noHBand="0" w:lastColumn="0" w:firstColumn="1" w:lastRow="0" w:firstRow="1"/>
       </w:tblPr>
       <w:tblGrid>
         <w:gridCol w:w="8820"/>
@@ -1975,8 +1956,6 @@
               <w:left w:val="nil"/>
               <w:bottom w:val="nil"/>
               <w:right w:val="nil"/>
-              <w:insideH w:val="nil"/>
-              <w:insideV w:val="nil"/>
             </w:tcBorders>
             <w:shd w:fill="auto" w:val="clear"/>
           </w:tcPr>
@@ -1990,7 +1969,7 @@
                 <w:tab w:val="left" w:pos="9720" w:leader="none"/>
               </w:tabs>
               <w:spacing w:lineRule="auto" w:line="240" w:before="0" w:after="0"/>
-              <w:ind w:right="360" w:hanging="0"/>
+              <w:ind w:hanging="0" w:right="360"/>
               <w:rPr>
                 <w:rFonts w:cs="Arial"/>
                 <w:sz w:val="24"/>
@@ -2135,18 +2114,19 @@
         <w:tblW w:w="9650" w:type="dxa"/>
         <w:jc w:val="left"/>
         <w:tblInd w:w="0" w:type="dxa"/>
+        <w:tblLayout w:type="fixed"/>
         <w:tblCellMar>
           <w:top w:w="0" w:type="dxa"/>
           <w:left w:w="115" w:type="dxa"/>
           <w:bottom w:w="0" w:type="dxa"/>
           <w:right w:w="115" w:type="dxa"/>
         </w:tblCellMar>
-        <w:tblLook w:noVBand="1" w:val="04a0" w:noHBand="0" w:lastColumn="0" w:firstColumn="1" w:lastRow="0" w:firstRow="1"/>
+        <w:tblLook w:val="04a0" w:noVBand="1" w:noHBand="0" w:lastColumn="0" w:firstColumn="1" w:lastRow="0" w:firstRow="1"/>
       </w:tblPr>
       <w:tblGrid>
         <w:gridCol w:w="5065"/>
-        <w:gridCol w:w="422"/>
-        <w:gridCol w:w="4163"/>
+        <w:gridCol w:w="421"/>
+        <w:gridCol w:w="4164"/>
       </w:tblGrid>
       <w:tr>
         <w:trPr/>
@@ -2158,8 +2138,6 @@
               <w:left w:val="nil"/>
               <w:bottom w:val="nil"/>
               <w:right w:val="nil"/>
-              <w:insideH w:val="nil"/>
-              <w:insideV w:val="nil"/>
             </w:tcBorders>
             <w:shd w:fill="auto" w:val="clear"/>
           </w:tcPr>
@@ -2183,14 +2161,12 @@
         </w:tc>
         <w:tc>
           <w:tcPr>
-            <w:tcW w:w="422" w:type="dxa"/>
+            <w:tcW w:w="421" w:type="dxa"/>
             <w:tcBorders>
               <w:top w:val="nil"/>
               <w:left w:val="nil"/>
               <w:bottom w:val="nil"/>
               <w:right w:val="nil"/>
-              <w:insideH w:val="nil"/>
-              <w:insideV w:val="nil"/>
             </w:tcBorders>
             <w:shd w:fill="auto" w:val="clear"/>
           </w:tcPr>
@@ -2203,7 +2179,7 @@
                 <w:tab w:val="left" w:pos="5490" w:leader="none"/>
               </w:tabs>
               <w:spacing w:lineRule="auto" w:line="240" w:before="0" w:after="0"/>
-              <w:ind w:left="-25" w:hanging="0"/>
+              <w:ind w:hanging="0" w:left="-25"/>
               <w:rPr/>
             </w:pPr>
             <w:r>
@@ -2214,14 +2190,12 @@
         </w:tc>
         <w:tc>
           <w:tcPr>
-            <w:tcW w:w="4163" w:type="dxa"/>
+            <w:tcW w:w="4164" w:type="dxa"/>
             <w:tcBorders>
               <w:top w:val="nil"/>
               <w:left w:val="nil"/>
               <w:bottom w:val="nil"/>
               <w:right w:val="nil"/>
-              <w:insideH w:val="nil"/>
-              <w:insideV w:val="nil"/>
             </w:tcBorders>
             <w:shd w:fill="auto" w:val="clear"/>
           </w:tcPr>
@@ -2370,7 +2344,7 @@
         <w:pStyle w:val="Normal"/>
         <w:widowControl w:val="false"/>
         <w:spacing w:lineRule="auto" w:line="240" w:before="20" w:after="0"/>
-        <w:ind w:right="-20" w:hanging="0"/>
+        <w:ind w:hanging="0" w:right="-20"/>
         <w:jc w:val="center"/>
         <w:rPr/>
       </w:pPr>
@@ -2600,7 +2574,7 @@
         <w:pStyle w:val="Normal"/>
         <w:widowControl w:val="false"/>
         <w:spacing w:lineRule="auto" w:line="240" w:before="0" w:after="0"/>
-        <w:ind w:right="-20" w:hanging="0"/>
+        <w:ind w:hanging="0" w:right="-20"/>
         <w:rPr/>
       </w:pPr>
       <w:r>
@@ -3581,31 +3555,24 @@
         <w:tblW w:w="10779" w:type="dxa"/>
         <w:jc w:val="left"/>
         <w:tblInd w:w="-591" w:type="dxa"/>
-        <w:tblBorders>
-          <w:top w:val="single" w:sz="4" w:space="0" w:color="000000"/>
-          <w:left w:val="single" w:sz="4" w:space="0" w:color="000000"/>
-          <w:bottom w:val="single" w:sz="4" w:space="0" w:color="000000"/>
-          <w:right w:val="single" w:sz="4" w:space="0" w:color="000000"/>
-          <w:insideH w:val="single" w:sz="4" w:space="0" w:color="000000"/>
-          <w:insideV w:val="single" w:sz="4" w:space="0" w:color="000000"/>
-        </w:tblBorders>
+        <w:tblLayout w:type="fixed"/>
         <w:tblCellMar>
           <w:top w:w="0" w:type="dxa"/>
           <w:left w:w="14" w:type="dxa"/>
           <w:bottom w:w="14" w:type="dxa"/>
           <w:right w:w="14" w:type="dxa"/>
         </w:tblCellMar>
-        <w:tblLook w:noVBand="0" w:val="0000" w:noHBand="0" w:lastColumn="0" w:firstColumn="0" w:lastRow="0" w:firstRow="0"/>
+        <w:tblLook w:val="0000" w:noVBand="0" w:noHBand="0" w:lastColumn="0" w:firstColumn="0" w:lastRow="0" w:firstRow="0"/>
       </w:tblPr>
       <w:tblGrid>
-        <w:gridCol w:w="2138"/>
+        <w:gridCol w:w="2137"/>
         <w:gridCol w:w="2272"/>
-        <w:gridCol w:w="519"/>
+        <w:gridCol w:w="520"/>
         <w:gridCol w:w="291"/>
         <w:gridCol w:w="429"/>
-        <w:gridCol w:w="770"/>
+        <w:gridCol w:w="769"/>
         <w:gridCol w:w="939"/>
-        <w:gridCol w:w="516"/>
+        <w:gridCol w:w="517"/>
         <w:gridCol w:w="2905"/>
       </w:tblGrid>
       <w:tr>
@@ -3621,8 +3588,6 @@
               <w:left w:val="single" w:sz="4" w:space="0" w:color="000000"/>
               <w:bottom w:val="single" w:sz="4" w:space="0" w:color="000000"/>
               <w:right w:val="single" w:sz="4" w:space="0" w:color="000000"/>
-              <w:insideH w:val="single" w:sz="4" w:space="0" w:color="000000"/>
-              <w:insideV w:val="single" w:sz="4" w:space="0" w:color="000000"/>
             </w:tcBorders>
             <w:shd w:color="auto" w:fill="BFBFBF" w:themeFill="background1" w:themeFillShade="bf" w:val="clear"/>
           </w:tcPr>
@@ -3636,7 +3601,7 @@
                 <w:tab w:val="left" w:pos="10600" w:leader="none"/>
               </w:tabs>
               <w:spacing w:lineRule="auto" w:line="240" w:before="11" w:after="0"/>
-              <w:ind w:left="-1" w:right="-120" w:hanging="0"/>
+              <w:ind w:hanging="0" w:left="-1" w:right="-120"/>
               <w:rPr/>
             </w:pPr>
             <w:r>
@@ -3822,8 +3787,7 @@
                 <w:bCs/>
                 <w:shd w:fill="C0C0C0" w:val="clear"/>
               </w:rPr>
-              <w:t xml:space="preserve">N </w:t>
-              <w:tab/>
+              <w:t>N</w:t>
             </w:r>
           </w:p>
         </w:tc>
@@ -3834,15 +3798,13 @@
         </w:trPr>
         <w:tc>
           <w:tcPr>
-            <w:tcW w:w="4410" w:type="dxa"/>
+            <w:tcW w:w="4409" w:type="dxa"/>
             <w:gridSpan w:val="2"/>
             <w:tcBorders>
               <w:top w:val="single" w:sz="4" w:space="0" w:color="000000"/>
               <w:left w:val="single" w:sz="4" w:space="0" w:color="000000"/>
               <w:bottom w:val="single" w:sz="4" w:space="0" w:color="000000"/>
               <w:right w:val="single" w:sz="4" w:space="0" w:color="000000"/>
-              <w:insideH w:val="single" w:sz="4" w:space="0" w:color="000000"/>
-              <w:insideV w:val="single" w:sz="4" w:space="0" w:color="000000"/>
             </w:tcBorders>
             <w:shd w:fill="auto" w:val="clear"/>
           </w:tcPr>
@@ -3851,7 +3813,7 @@
               <w:pStyle w:val="Normal"/>
               <w:widowControl w:val="false"/>
               <w:spacing w:lineRule="auto" w:line="240" w:before="39" w:after="0"/>
-              <w:ind w:left="102" w:right="-20" w:hanging="0"/>
+              <w:ind w:hanging="0" w:left="102" w:right="-20"/>
               <w:rPr/>
             </w:pPr>
             <w:r>
@@ -3875,8 +3837,6 @@
               <w:left w:val="single" w:sz="4" w:space="0" w:color="000000"/>
               <w:bottom w:val="single" w:sz="4" w:space="0" w:color="000000"/>
               <w:right w:val="single" w:sz="4" w:space="0" w:color="000000"/>
-              <w:insideH w:val="single" w:sz="4" w:space="0" w:color="000000"/>
-              <w:insideV w:val="single" w:sz="4" w:space="0" w:color="000000"/>
             </w:tcBorders>
             <w:shd w:fill="auto" w:val="clear"/>
           </w:tcPr>
@@ -3885,7 +3845,7 @@
               <w:pStyle w:val="Normal"/>
               <w:widowControl w:val="false"/>
               <w:spacing w:lineRule="auto" w:line="240" w:before="39" w:after="0"/>
-              <w:ind w:left="100" w:right="-20" w:hanging="0"/>
+              <w:ind w:hanging="0" w:left="100" w:right="-20"/>
               <w:rPr/>
             </w:pPr>
             <w:r>
@@ -3899,21 +3859,19 @@
               <w:rPr>
                 <w:rFonts w:cs="Arial"/>
               </w:rPr>
-              <w:t xml:space="preserve">${DOB} </w:t>
+              <w:t>${DOB}</w:t>
             </w:r>
           </w:p>
         </w:tc>
         <w:tc>
           <w:tcPr>
-            <w:tcW w:w="4360" w:type="dxa"/>
+            <w:tcW w:w="4361" w:type="dxa"/>
             <w:gridSpan w:val="3"/>
             <w:tcBorders>
               <w:top w:val="single" w:sz="4" w:space="0" w:color="000000"/>
               <w:left w:val="single" w:sz="4" w:space="0" w:color="000000"/>
               <w:bottom w:val="single" w:sz="4" w:space="0" w:color="000000"/>
               <w:right w:val="single" w:sz="4" w:space="0" w:color="000000"/>
-              <w:insideH w:val="single" w:sz="4" w:space="0" w:color="000000"/>
-              <w:insideV w:val="single" w:sz="4" w:space="0" w:color="000000"/>
             </w:tcBorders>
             <w:shd w:fill="auto" w:val="clear"/>
           </w:tcPr>
@@ -3922,7 +3880,7 @@
               <w:pStyle w:val="Normal"/>
               <w:widowControl w:val="false"/>
               <w:spacing w:lineRule="auto" w:line="240" w:before="39" w:after="0"/>
-              <w:ind w:left="102" w:right="-20" w:hanging="0"/>
+              <w:ind w:hanging="0" w:left="102" w:right="-20"/>
               <w:rPr/>
             </w:pPr>
             <w:r>
@@ -4073,15 +4031,13 @@
         </w:trPr>
         <w:tc>
           <w:tcPr>
-            <w:tcW w:w="4410" w:type="dxa"/>
+            <w:tcW w:w="4409" w:type="dxa"/>
             <w:gridSpan w:val="2"/>
             <w:tcBorders>
               <w:top w:val="single" w:sz="4" w:space="0" w:color="000000"/>
               <w:left w:val="single" w:sz="4" w:space="0" w:color="000000"/>
               <w:bottom w:val="single" w:sz="4" w:space="0" w:color="000000"/>
               <w:right w:val="single" w:sz="4" w:space="0" w:color="000000"/>
-              <w:insideH w:val="single" w:sz="4" w:space="0" w:color="000000"/>
-              <w:insideV w:val="single" w:sz="4" w:space="0" w:color="000000"/>
             </w:tcBorders>
             <w:shd w:fill="auto" w:val="clear"/>
           </w:tcPr>
@@ -4090,7 +4046,7 @@
               <w:pStyle w:val="Normal"/>
               <w:widowControl w:val="false"/>
               <w:spacing w:lineRule="exact" w:line="205" w:before="0" w:after="0"/>
-              <w:ind w:left="102" w:right="-20" w:hanging="0"/>
+              <w:ind w:hanging="0" w:left="102" w:right="-20"/>
               <w:rPr/>
             </w:pPr>
             <w:r>
@@ -4152,7 +4108,7 @@
               <w:pStyle w:val="Normal"/>
               <w:widowControl w:val="false"/>
               <w:spacing w:lineRule="exact" w:line="205" w:before="0" w:after="0"/>
-              <w:ind w:left="102" w:right="-20" w:hanging="0"/>
+              <w:ind w:hanging="0" w:left="102" w:right="-20"/>
               <w:rPr>
                 <w:rFonts w:cs="Arial"/>
               </w:rPr>
@@ -4169,7 +4125,7 @@
               <w:pStyle w:val="Normal"/>
               <w:widowControl w:val="false"/>
               <w:spacing w:lineRule="exact" w:line="205" w:before="0" w:after="0"/>
-              <w:ind w:left="102" w:right="-20" w:hanging="0"/>
+              <w:ind w:hanging="0" w:left="102" w:right="-20"/>
               <w:rPr/>
             </w:pPr>
             <w:r>
@@ -4182,13 +4138,13 @@
         </w:tc>
         <w:tc>
           <w:tcPr>
-            <w:tcW w:w="6369" w:type="dxa"/>
+            <w:tcW w:w="6370" w:type="dxa"/>
             <w:gridSpan w:val="7"/>
             <w:tcBorders>
               <w:top w:val="single" w:sz="4" w:space="0" w:color="000000"/>
               <w:left w:val="single" w:sz="4" w:space="0" w:color="000000"/>
+              <w:bottom w:val="single" w:sz="4" w:space="0" w:color="000000"/>
               <w:right w:val="single" w:sz="4" w:space="0" w:color="000000"/>
-              <w:insideV w:val="single" w:sz="4" w:space="0" w:color="000000"/>
             </w:tcBorders>
             <w:shd w:fill="auto" w:val="clear"/>
           </w:tcPr>
@@ -4197,7 +4153,7 @@
               <w:pStyle w:val="Normal"/>
               <w:widowControl w:val="false"/>
               <w:spacing w:lineRule="auto" w:line="240" w:before="17" w:after="0"/>
-              <w:ind w:left="102" w:right="-20" w:hanging="0"/>
+              <w:ind w:hanging="0" w:left="102" w:right="-20"/>
               <w:rPr/>
             </w:pPr>
             <w:r>
@@ -4264,8 +4220,6 @@
               <w:left w:val="single" w:sz="4" w:space="0" w:color="000000"/>
               <w:bottom w:val="single" w:sz="4" w:space="0" w:color="000000"/>
               <w:right w:val="single" w:sz="4" w:space="0" w:color="000000"/>
-              <w:insideH w:val="single" w:sz="4" w:space="0" w:color="000000"/>
-              <w:insideV w:val="single" w:sz="4" w:space="0" w:color="000000"/>
             </w:tcBorders>
             <w:shd w:color="auto" w:fill="C0C0C0" w:val="clear"/>
           </w:tcPr>
@@ -4274,7 +4228,7 @@
               <w:pStyle w:val="Normal"/>
               <w:widowControl w:val="false"/>
               <w:spacing w:lineRule="auto" w:line="240" w:before="30" w:after="0"/>
-              <w:ind w:left="4155" w:right="4089" w:hanging="0"/>
+              <w:ind w:hanging="0" w:left="4155" w:right="4089"/>
               <w:jc w:val="center"/>
               <w:rPr/>
             </w:pPr>
@@ -4417,8 +4371,6 @@
               <w:left w:val="single" w:sz="4" w:space="0" w:color="000000"/>
               <w:bottom w:val="single" w:sz="8" w:space="0" w:color="000000"/>
               <w:right w:val="single" w:sz="4" w:space="0" w:color="000000"/>
-              <w:insideH w:val="single" w:sz="8" w:space="0" w:color="000000"/>
-              <w:insideV w:val="single" w:sz="4" w:space="0" w:color="000000"/>
             </w:tcBorders>
             <w:shd w:fill="auto" w:val="clear"/>
           </w:tcPr>
@@ -4427,7 +4379,7 @@
               <w:pStyle w:val="Normal"/>
               <w:widowControl w:val="false"/>
               <w:spacing w:lineRule="exact" w:line="204" w:before="0" w:after="0"/>
-              <w:ind w:left="102" w:right="-20" w:hanging="0"/>
+              <w:ind w:hanging="0" w:left="102" w:right="-20"/>
               <w:rPr/>
             </w:pPr>
             <w:r>
@@ -4479,7 +4431,7 @@
               <w:pStyle w:val="Normal"/>
               <w:widowControl w:val="false"/>
               <w:spacing w:lineRule="exact" w:line="204" w:before="0" w:after="0"/>
-              <w:ind w:left="102" w:right="-20" w:hanging="0"/>
+              <w:ind w:hanging="0" w:left="102" w:right="-20"/>
               <w:rPr/>
             </w:pPr>
             <w:r>
@@ -4500,8 +4452,6 @@
               <w:left w:val="single" w:sz="4" w:space="0" w:color="000000"/>
               <w:bottom w:val="single" w:sz="8" w:space="0" w:color="000000"/>
               <w:right w:val="single" w:sz="4" w:space="0" w:color="000000"/>
-              <w:insideH w:val="single" w:sz="8" w:space="0" w:color="000000"/>
-              <w:insideV w:val="single" w:sz="4" w:space="0" w:color="000000"/>
             </w:tcBorders>
             <w:shd w:fill="auto" w:val="clear"/>
           </w:tcPr>
@@ -4510,7 +4460,7 @@
               <w:pStyle w:val="Normal"/>
               <w:widowControl w:val="false"/>
               <w:spacing w:lineRule="exact" w:line="203" w:before="0" w:after="0"/>
-              <w:ind w:left="102" w:right="-20" w:hanging="0"/>
+              <w:ind w:hanging="0" w:left="102" w:right="-20"/>
               <w:rPr/>
             </w:pPr>
             <w:r>
@@ -4586,8 +4536,6 @@
               <w:left w:val="single" w:sz="4" w:space="0" w:color="000000"/>
               <w:bottom w:val="single" w:sz="8" w:space="0" w:color="000000"/>
               <w:right w:val="single" w:sz="4" w:space="0" w:color="000000"/>
-              <w:insideH w:val="single" w:sz="8" w:space="0" w:color="000000"/>
-              <w:insideV w:val="single" w:sz="4" w:space="0" w:color="000000"/>
             </w:tcBorders>
             <w:shd w:fill="auto" w:val="clear"/>
           </w:tcPr>
@@ -4596,7 +4544,7 @@
               <w:pStyle w:val="Normal"/>
               <w:widowControl w:val="false"/>
               <w:spacing w:lineRule="exact" w:line="206" w:before="0" w:after="0"/>
-              <w:ind w:left="102" w:right="-20" w:hanging="0"/>
+              <w:ind w:hanging="0" w:left="102" w:right="-20"/>
               <w:rPr>
                 <w:rFonts w:cs="Arial"/>
               </w:rPr>
@@ -4675,7 +4623,7 @@
                 <w:rFonts w:cs="Arial"/>
                 <w:b/>
               </w:rPr>
-              <w:t xml:space="preserve">r(s): </w:t>
+              <w:t>r(s):</w:t>
             </w:r>
           </w:p>
           <w:tbl>
@@ -4684,13 +4632,14 @@
               <w:tblW w:w="5182" w:type="dxa"/>
               <w:jc w:val="left"/>
               <w:tblInd w:w="0" w:type="dxa"/>
+              <w:tblLayout w:type="fixed"/>
               <w:tblCellMar>
                 <w:top w:w="0" w:type="dxa"/>
                 <w:left w:w="108" w:type="dxa"/>
                 <w:bottom w:w="0" w:type="dxa"/>
                 <w:right w:w="108" w:type="dxa"/>
               </w:tblCellMar>
-              <w:tblLook w:noVBand="1" w:val="04a0" w:noHBand="0" w:lastColumn="0" w:firstColumn="1" w:lastRow="0" w:firstRow="1"/>
+              <w:tblLook w:val="04a0" w:noVBand="1" w:noHBand="0" w:lastColumn="0" w:firstColumn="1" w:lastRow="0" w:firstRow="1"/>
             </w:tblPr>
             <w:tblGrid>
               <w:gridCol w:w="5182"/>
@@ -4705,8 +4654,6 @@
                     <w:left w:val="nil"/>
                     <w:bottom w:val="nil"/>
                     <w:right w:val="nil"/>
-                    <w:insideH w:val="nil"/>
-                    <w:insideV w:val="nil"/>
                   </w:tcBorders>
                   <w:shd w:fill="auto" w:val="clear"/>
                 </w:tcPr>
@@ -4715,7 +4662,7 @@
                     <w:pStyle w:val="Normal"/>
                     <w:widowControl w:val="false"/>
                     <w:spacing w:lineRule="exact" w:line="206" w:before="0" w:after="0"/>
-                    <w:ind w:right="-20" w:hanging="0"/>
+                    <w:ind w:hanging="0" w:right="-20"/>
                     <w:rPr>
                       <w:rFonts w:cs="Arial"/>
                     </w:rPr>
@@ -4733,7 +4680,7 @@
               <w:pStyle w:val="Normal"/>
               <w:widowControl w:val="false"/>
               <w:spacing w:lineRule="exact" w:line="206" w:before="0" w:after="0"/>
-              <w:ind w:left="102" w:right="-20" w:hanging="0"/>
+              <w:ind w:hanging="0" w:left="102" w:right="-20"/>
               <w:rPr/>
             </w:pPr>
             <w:r>
@@ -4748,8 +4695,8 @@
             <w:tcBorders>
               <w:top w:val="single" w:sz="8" w:space="0" w:color="000000"/>
               <w:left w:val="single" w:sz="4" w:space="0" w:color="000000"/>
+              <w:bottom w:val="single" w:sz="4" w:space="0" w:color="000000"/>
               <w:right w:val="single" w:sz="4" w:space="0" w:color="000000"/>
-              <w:insideV w:val="single" w:sz="4" w:space="0" w:color="000000"/>
             </w:tcBorders>
             <w:shd w:fill="auto" w:val="clear"/>
           </w:tcPr>
@@ -4758,7 +4705,7 @@
               <w:pStyle w:val="Normal"/>
               <w:widowControl w:val="false"/>
               <w:spacing w:lineRule="exact" w:line="205" w:before="0" w:after="0"/>
-              <w:ind w:left="85" w:right="-20" w:hanging="0"/>
+              <w:ind w:hanging="0" w:left="85" w:right="-20"/>
               <w:rPr/>
             </w:pPr>
             <w:r>
@@ -4967,8 +4914,6 @@
               <w:left w:val="single" w:sz="4" w:space="0" w:color="000000"/>
               <w:bottom w:val="single" w:sz="8" w:space="0" w:color="000000"/>
               <w:right w:val="single" w:sz="4" w:space="0" w:color="000000"/>
-              <w:insideH w:val="single" w:sz="8" w:space="0" w:color="000000"/>
-              <w:insideV w:val="single" w:sz="4" w:space="0" w:color="000000"/>
             </w:tcBorders>
             <w:shd w:fill="auto" w:val="clear"/>
           </w:tcPr>
@@ -4977,7 +4922,7 @@
               <w:pStyle w:val="Normal"/>
               <w:widowControl w:val="false"/>
               <w:spacing w:lineRule="exact" w:line="205" w:before="0" w:after="0"/>
-              <w:ind w:left="102" w:right="-20" w:hanging="0"/>
+              <w:ind w:hanging="0" w:left="102" w:right="-20"/>
               <w:rPr/>
             </w:pPr>
             <w:r>
@@ -5139,7 +5084,7 @@
               <w:pStyle w:val="Normal"/>
               <w:widowControl w:val="false"/>
               <w:spacing w:lineRule="exact" w:line="205" w:before="0" w:after="0"/>
-              <w:ind w:left="102" w:right="-20" w:hanging="0"/>
+              <w:ind w:hanging="0" w:left="102" w:right="-20"/>
               <w:rPr/>
             </w:pPr>
             <w:r>
@@ -5165,8 +5110,6 @@
               <w:left w:val="single" w:sz="4" w:space="0" w:color="000000"/>
               <w:bottom w:val="single" w:sz="8" w:space="0" w:color="000000"/>
               <w:right w:val="single" w:sz="4" w:space="0" w:color="000000"/>
-              <w:insideH w:val="single" w:sz="8" w:space="0" w:color="000000"/>
-              <w:insideV w:val="single" w:sz="4" w:space="0" w:color="000000"/>
             </w:tcBorders>
             <w:shd w:fill="auto" w:val="clear"/>
           </w:tcPr>
@@ -5175,7 +5118,7 @@
               <w:pStyle w:val="Normal"/>
               <w:widowControl w:val="false"/>
               <w:spacing w:lineRule="exact" w:line="205" w:before="0" w:after="0"/>
-              <w:ind w:left="102" w:right="-20" w:hanging="0"/>
+              <w:ind w:hanging="0" w:left="102" w:right="-20"/>
               <w:rPr/>
             </w:pPr>
             <w:r>
@@ -5252,7 +5195,7 @@
               <w:pStyle w:val="Normal"/>
               <w:widowControl w:val="false"/>
               <w:spacing w:lineRule="exact" w:line="205" w:before="0" w:after="0"/>
-              <w:ind w:left="102" w:right="-20" w:hanging="0"/>
+              <w:ind w:hanging="0" w:left="102" w:right="-20"/>
               <w:rPr/>
             </w:pPr>
             <w:r>
@@ -5271,8 +5214,6 @@
               <w:left w:val="single" w:sz="4" w:space="0" w:color="000000"/>
               <w:bottom w:val="single" w:sz="8" w:space="0" w:color="000000"/>
               <w:right w:val="single" w:sz="4" w:space="0" w:color="000000"/>
-              <w:insideH w:val="single" w:sz="8" w:space="0" w:color="000000"/>
-              <w:insideV w:val="single" w:sz="4" w:space="0" w:color="000000"/>
             </w:tcBorders>
             <w:shd w:fill="auto" w:val="clear"/>
           </w:tcPr>
@@ -5281,7 +5222,7 @@
               <w:pStyle w:val="Normal"/>
               <w:widowControl w:val="false"/>
               <w:spacing w:lineRule="exact" w:line="204" w:before="0" w:after="0"/>
-              <w:ind w:left="102" w:right="-20" w:hanging="0"/>
+              <w:ind w:hanging="0" w:left="102" w:right="-20"/>
               <w:rPr/>
             </w:pPr>
             <w:r>
@@ -5406,7 +5347,7 @@
               <w:pStyle w:val="Normal"/>
               <w:widowControl w:val="false"/>
               <w:spacing w:lineRule="exact" w:line="204" w:before="0" w:after="0"/>
-              <w:ind w:left="102" w:right="-20" w:hanging="0"/>
+              <w:ind w:hanging="0" w:left="102" w:right="-20"/>
               <w:rPr/>
             </w:pPr>
             <w:r>
@@ -5429,8 +5370,6 @@
               <w:left w:val="single" w:sz="4" w:space="0" w:color="000000"/>
               <w:bottom w:val="single" w:sz="4" w:space="0" w:color="000000"/>
               <w:right w:val="single" w:sz="4" w:space="0" w:color="000000"/>
-              <w:insideH w:val="single" w:sz="4" w:space="0" w:color="000000"/>
-              <w:insideV w:val="single" w:sz="4" w:space="0" w:color="000000"/>
             </w:tcBorders>
             <w:shd w:fill="auto" w:val="clear"/>
           </w:tcPr>
@@ -5439,7 +5378,7 @@
               <w:pStyle w:val="Normal"/>
               <w:widowControl w:val="false"/>
               <w:spacing w:lineRule="exact" w:line="205" w:before="0" w:after="0"/>
-              <w:ind w:left="102" w:right="-20" w:hanging="0"/>
+              <w:ind w:hanging="0" w:left="102" w:right="-20"/>
               <w:rPr/>
             </w:pPr>
             <w:r>
@@ -5524,7 +5463,7 @@
               <w:pStyle w:val="Normal"/>
               <w:widowControl w:val="false"/>
               <w:spacing w:lineRule="exact" w:line="205" w:before="0" w:after="0"/>
-              <w:ind w:left="102" w:right="-20" w:hanging="0"/>
+              <w:ind w:hanging="0" w:left="102" w:right="-20"/>
               <w:rPr/>
             </w:pPr>
             <w:r>
@@ -5542,8 +5481,6 @@
               <w:left w:val="single" w:sz="4" w:space="0" w:color="000000"/>
               <w:bottom w:val="single" w:sz="4" w:space="0" w:color="000000"/>
               <w:right w:val="single" w:sz="4" w:space="0" w:color="000000"/>
-              <w:insideH w:val="single" w:sz="4" w:space="0" w:color="000000"/>
-              <w:insideV w:val="single" w:sz="4" w:space="0" w:color="000000"/>
             </w:tcBorders>
             <w:shd w:fill="auto" w:val="clear"/>
           </w:tcPr>
@@ -5552,7 +5489,7 @@
               <w:pStyle w:val="Normal"/>
               <w:widowControl w:val="false"/>
               <w:spacing w:lineRule="exact" w:line="205" w:before="0" w:after="0"/>
-              <w:ind w:left="102" w:right="-20" w:hanging="0"/>
+              <w:ind w:hanging="0" w:left="102" w:right="-20"/>
               <w:rPr/>
             </w:pPr>
             <w:r>
@@ -5614,7 +5551,7 @@
               <w:pStyle w:val="Normal"/>
               <w:widowControl w:val="false"/>
               <w:spacing w:lineRule="exact" w:line="205" w:before="0" w:after="0"/>
-              <w:ind w:left="102" w:right="-20" w:hanging="0"/>
+              <w:ind w:hanging="0" w:left="102" w:right="-20"/>
               <w:rPr/>
             </w:pPr>
             <w:r>
@@ -5637,8 +5574,6 @@
               <w:left w:val="single" w:sz="4" w:space="0" w:color="000000"/>
               <w:bottom w:val="single" w:sz="4" w:space="0" w:color="000000"/>
               <w:right w:val="single" w:sz="4" w:space="0" w:color="000000"/>
-              <w:insideH w:val="single" w:sz="4" w:space="0" w:color="000000"/>
-              <w:insideV w:val="single" w:sz="4" w:space="0" w:color="000000"/>
             </w:tcBorders>
             <w:shd w:fill="auto" w:val="clear"/>
           </w:tcPr>
@@ -5647,7 +5582,7 @@
               <w:pStyle w:val="Normal"/>
               <w:widowControl w:val="false"/>
               <w:spacing w:lineRule="auto" w:line="240" w:before="31" w:after="0"/>
-              <w:ind w:left="102" w:right="52" w:hanging="0"/>
+              <w:ind w:hanging="0" w:left="102" w:right="52"/>
               <w:jc w:val="center"/>
               <w:rPr/>
             </w:pPr>
@@ -5666,14 +5601,12 @@
         <w:trPr/>
         <w:tc>
           <w:tcPr>
-            <w:tcW w:w="2138" w:type="dxa"/>
+            <w:tcW w:w="2137" w:type="dxa"/>
             <w:tcBorders>
               <w:top w:val="single" w:sz="4" w:space="0" w:color="000000"/>
               <w:left w:val="single" w:sz="4" w:space="0" w:color="000000"/>
               <w:bottom w:val="single" w:sz="4" w:space="0" w:color="000000"/>
               <w:right w:val="single" w:sz="4" w:space="0" w:color="000000"/>
-              <w:insideH w:val="single" w:sz="4" w:space="0" w:color="000000"/>
-              <w:insideV w:val="single" w:sz="4" w:space="0" w:color="000000"/>
             </w:tcBorders>
             <w:shd w:fill="auto" w:val="clear"/>
           </w:tcPr>
@@ -5682,7 +5615,7 @@
               <w:pStyle w:val="Normal"/>
               <w:widowControl w:val="false"/>
               <w:spacing w:lineRule="auto" w:line="240" w:before="1" w:after="0"/>
-              <w:ind w:left="102" w:right="-20" w:hanging="0"/>
+              <w:ind w:hanging="0" w:left="102" w:right="-20"/>
               <w:rPr/>
             </w:pPr>
             <w:r>
@@ -5697,15 +5630,13 @@
         </w:tc>
         <w:tc>
           <w:tcPr>
-            <w:tcW w:w="2791" w:type="dxa"/>
+            <w:tcW w:w="2792" w:type="dxa"/>
             <w:gridSpan w:val="2"/>
             <w:tcBorders>
               <w:top w:val="single" w:sz="4" w:space="0" w:color="000000"/>
               <w:left w:val="single" w:sz="4" w:space="0" w:color="000000"/>
               <w:bottom w:val="single" w:sz="4" w:space="0" w:color="000000"/>
               <w:right w:val="single" w:sz="4" w:space="0" w:color="000000"/>
-              <w:insideH w:val="single" w:sz="4" w:space="0" w:color="000000"/>
-              <w:insideV w:val="single" w:sz="4" w:space="0" w:color="000000"/>
             </w:tcBorders>
             <w:shd w:fill="auto" w:val="clear"/>
           </w:tcPr>
@@ -5714,7 +5645,7 @@
               <w:pStyle w:val="Normal"/>
               <w:widowControl w:val="false"/>
               <w:spacing w:lineRule="auto" w:line="240" w:before="0" w:after="0"/>
-              <w:ind w:left="102" w:right="-20" w:hanging="0"/>
+              <w:ind w:hanging="0" w:left="102" w:right="-20"/>
               <w:rPr/>
             </w:pPr>
             <w:r>
@@ -5844,8 +5775,6 @@
               <w:left w:val="single" w:sz="4" w:space="0" w:color="000000"/>
               <w:bottom w:val="single" w:sz="4" w:space="0" w:color="000000"/>
               <w:right w:val="single" w:sz="4" w:space="0" w:color="000000"/>
-              <w:insideH w:val="single" w:sz="4" w:space="0" w:color="000000"/>
-              <w:insideV w:val="single" w:sz="4" w:space="0" w:color="000000"/>
             </w:tcBorders>
             <w:shd w:fill="auto" w:val="clear"/>
           </w:tcPr>
@@ -5854,7 +5783,7 @@
               <w:pStyle w:val="Normal"/>
               <w:widowControl w:val="false"/>
               <w:spacing w:lineRule="auto" w:line="240" w:before="0" w:after="0"/>
-              <w:ind w:left="100" w:right="-20" w:hanging="0"/>
+              <w:ind w:hanging="0" w:left="100" w:right="-20"/>
               <w:jc w:val="both"/>
               <w:rPr/>
             </w:pPr>
@@ -5884,15 +5813,13 @@
         </w:tc>
         <w:tc>
           <w:tcPr>
-            <w:tcW w:w="1709" w:type="dxa"/>
+            <w:tcW w:w="1708" w:type="dxa"/>
             <w:gridSpan w:val="2"/>
             <w:tcBorders>
               <w:top w:val="single" w:sz="4" w:space="0" w:color="000000"/>
               <w:left w:val="single" w:sz="4" w:space="0" w:color="000000"/>
               <w:bottom w:val="single" w:sz="4" w:space="0" w:color="000000"/>
               <w:right w:val="single" w:sz="4" w:space="0" w:color="000000"/>
-              <w:insideH w:val="single" w:sz="4" w:space="0" w:color="000000"/>
-              <w:insideV w:val="single" w:sz="4" w:space="0" w:color="000000"/>
             </w:tcBorders>
             <w:shd w:fill="auto" w:val="clear"/>
           </w:tcPr>
@@ -5901,10 +5828,9 @@
               <w:pStyle w:val="Normal"/>
               <w:widowControl w:val="false"/>
               <w:spacing w:lineRule="auto" w:line="240" w:before="0" w:after="0"/>
-              <w:ind w:left="100" w:right="-20" w:hanging="0"/>
+              <w:ind w:hanging="0" w:left="100" w:right="-20"/>
               <w:jc w:val="both"/>
               <w:rPr>
-                <w:b/>
                 <w:b/>
               </w:rPr>
             </w:pPr>
@@ -5918,15 +5844,13 @@
         </w:tc>
         <w:tc>
           <w:tcPr>
-            <w:tcW w:w="3421" w:type="dxa"/>
+            <w:tcW w:w="3422" w:type="dxa"/>
             <w:gridSpan w:val="2"/>
             <w:tcBorders>
               <w:top w:val="single" w:sz="4" w:space="0" w:color="000000"/>
               <w:left w:val="single" w:sz="4" w:space="0" w:color="000000"/>
               <w:bottom w:val="single" w:sz="4" w:space="0" w:color="000000"/>
               <w:right w:val="single" w:sz="4" w:space="0" w:color="000000"/>
-              <w:insideH w:val="single" w:sz="4" w:space="0" w:color="000000"/>
-              <w:insideV w:val="single" w:sz="4" w:space="0" w:color="000000"/>
             </w:tcBorders>
             <w:shd w:fill="auto" w:val="clear"/>
           </w:tcPr>
@@ -5935,7 +5859,7 @@
               <w:pStyle w:val="Normal"/>
               <w:widowControl w:val="false"/>
               <w:spacing w:lineRule="auto" w:line="240" w:before="0" w:after="0"/>
-              <w:ind w:left="100" w:right="-20" w:hanging="0"/>
+              <w:ind w:hanging="0" w:left="100" w:right="-20"/>
               <w:rPr/>
             </w:pPr>
             <w:r>
@@ -6009,14 +5933,12 @@
         </w:trPr>
         <w:tc>
           <w:tcPr>
-            <w:tcW w:w="2138" w:type="dxa"/>
+            <w:tcW w:w="2137" w:type="dxa"/>
             <w:tcBorders>
               <w:top w:val="single" w:sz="4" w:space="0" w:color="000000"/>
               <w:left w:val="single" w:sz="4" w:space="0" w:color="000000"/>
               <w:bottom w:val="single" w:sz="4" w:space="0" w:color="000000"/>
               <w:right w:val="single" w:sz="4" w:space="0" w:color="000000"/>
-              <w:insideH w:val="single" w:sz="4" w:space="0" w:color="000000"/>
-              <w:insideV w:val="single" w:sz="4" w:space="0" w:color="000000"/>
             </w:tcBorders>
             <w:shd w:fill="auto" w:val="clear"/>
           </w:tcPr>
@@ -6025,7 +5947,7 @@
               <w:pStyle w:val="Normal"/>
               <w:widowControl w:val="false"/>
               <w:spacing w:lineRule="auto" w:line="240" w:before="0" w:after="0"/>
-              <w:ind w:left="100" w:right="-20" w:hanging="0"/>
+              <w:ind w:hanging="0" w:left="100" w:right="-20"/>
               <w:rPr>
                 <w:rFonts w:cs="Arial"/>
               </w:rPr>
@@ -6040,15 +5962,13 @@
         </w:tc>
         <w:tc>
           <w:tcPr>
-            <w:tcW w:w="2791" w:type="dxa"/>
+            <w:tcW w:w="2792" w:type="dxa"/>
             <w:gridSpan w:val="2"/>
             <w:tcBorders>
               <w:top w:val="single" w:sz="4" w:space="0" w:color="000000"/>
               <w:left w:val="single" w:sz="4" w:space="0" w:color="000000"/>
               <w:bottom w:val="single" w:sz="4" w:space="0" w:color="000000"/>
               <w:right w:val="single" w:sz="4" w:space="0" w:color="000000"/>
-              <w:insideH w:val="single" w:sz="4" w:space="0" w:color="000000"/>
-              <w:insideV w:val="single" w:sz="4" w:space="0" w:color="000000"/>
             </w:tcBorders>
             <w:shd w:fill="auto" w:val="clear"/>
           </w:tcPr>
@@ -6057,7 +5977,7 @@
               <w:pStyle w:val="Normal"/>
               <w:widowControl w:val="false"/>
               <w:spacing w:lineRule="auto" w:line="240" w:before="0" w:after="0"/>
-              <w:ind w:left="100" w:right="-20" w:hanging="0"/>
+              <w:ind w:hanging="0" w:left="100" w:right="-20"/>
               <w:rPr>
                 <w:rFonts w:cs="Arial"/>
               </w:rPr>
@@ -6079,8 +5999,6 @@
               <w:left w:val="single" w:sz="4" w:space="0" w:color="000000"/>
               <w:bottom w:val="single" w:sz="4" w:space="0" w:color="000000"/>
               <w:right w:val="single" w:sz="4" w:space="0" w:color="000000"/>
-              <w:insideH w:val="single" w:sz="4" w:space="0" w:color="000000"/>
-              <w:insideV w:val="single" w:sz="4" w:space="0" w:color="000000"/>
             </w:tcBorders>
             <w:shd w:fill="auto" w:val="clear"/>
           </w:tcPr>
@@ -6089,7 +6007,7 @@
               <w:pStyle w:val="Normal"/>
               <w:widowControl w:val="false"/>
               <w:spacing w:lineRule="auto" w:line="240" w:before="0" w:after="0"/>
-              <w:ind w:left="100" w:right="-20" w:hanging="0"/>
+              <w:ind w:hanging="0" w:left="100" w:right="-20"/>
               <w:rPr>
                 <w:rFonts w:cs="Arial"/>
               </w:rPr>
@@ -6104,15 +6022,13 @@
         </w:tc>
         <w:tc>
           <w:tcPr>
-            <w:tcW w:w="1709" w:type="dxa"/>
+            <w:tcW w:w="1708" w:type="dxa"/>
             <w:gridSpan w:val="2"/>
             <w:tcBorders>
               <w:top w:val="single" w:sz="4" w:space="0" w:color="000000"/>
               <w:left w:val="single" w:sz="4" w:space="0" w:color="000000"/>
               <w:bottom w:val="single" w:sz="4" w:space="0" w:color="000000"/>
               <w:right w:val="single" w:sz="4" w:space="0" w:color="000000"/>
-              <w:insideH w:val="single" w:sz="4" w:space="0" w:color="000000"/>
-              <w:insideV w:val="single" w:sz="4" w:space="0" w:color="000000"/>
             </w:tcBorders>
             <w:shd w:fill="auto" w:val="clear"/>
           </w:tcPr>
@@ -6121,7 +6037,7 @@
               <w:pStyle w:val="Normal"/>
               <w:widowControl w:val="false"/>
               <w:spacing w:lineRule="auto" w:line="240" w:before="0" w:after="0"/>
-              <w:ind w:left="100" w:right="-20" w:hanging="0"/>
+              <w:ind w:hanging="0" w:left="100" w:right="-20"/>
               <w:rPr/>
             </w:pPr>
             <w:r>
@@ -6132,15 +6048,13 @@
         </w:tc>
         <w:tc>
           <w:tcPr>
-            <w:tcW w:w="3421" w:type="dxa"/>
+            <w:tcW w:w="3422" w:type="dxa"/>
             <w:gridSpan w:val="2"/>
             <w:tcBorders>
               <w:top w:val="single" w:sz="4" w:space="0" w:color="000000"/>
               <w:left w:val="single" w:sz="4" w:space="0" w:color="000000"/>
               <w:bottom w:val="single" w:sz="4" w:space="0" w:color="000000"/>
               <w:right w:val="single" w:sz="4" w:space="0" w:color="000000"/>
-              <w:insideH w:val="single" w:sz="4" w:space="0" w:color="000000"/>
-              <w:insideV w:val="single" w:sz="4" w:space="0" w:color="000000"/>
             </w:tcBorders>
             <w:shd w:fill="auto" w:val="clear"/>
           </w:tcPr>
@@ -6149,7 +6063,7 @@
               <w:pStyle w:val="Normal"/>
               <w:widowControl w:val="false"/>
               <w:spacing w:lineRule="auto" w:line="240" w:before="0" w:after="0"/>
-              <w:ind w:left="100" w:right="-20" w:hanging="0"/>
+              <w:ind w:hanging="0" w:left="100" w:right="-20"/>
               <w:rPr>
                 <w:rFonts w:cs="Arial"/>
               </w:rPr>
@@ -6176,8 +6090,6 @@
               <w:left w:val="single" w:sz="4" w:space="0" w:color="000000"/>
               <w:bottom w:val="single" w:sz="8" w:space="0" w:color="000000"/>
               <w:right w:val="single" w:sz="4" w:space="0" w:color="000000"/>
-              <w:insideH w:val="single" w:sz="8" w:space="0" w:color="000000"/>
-              <w:insideV w:val="single" w:sz="4" w:space="0" w:color="000000"/>
             </w:tcBorders>
             <w:shd w:fill="auto" w:val="clear"/>
           </w:tcPr>
@@ -6186,7 +6098,7 @@
               <w:pStyle w:val="Normal"/>
               <w:widowControl w:val="false"/>
               <w:spacing w:lineRule="auto" w:line="240" w:before="0" w:after="0"/>
-              <w:ind w:left="55" w:hanging="0"/>
+              <w:ind w:hanging="0" w:left="55"/>
               <w:rPr/>
             </w:pPr>
             <w:r>
@@ -6204,9 +6116,8 @@
                 <w:tab w:val="left" w:pos="10060" w:leader="none"/>
               </w:tabs>
               <w:spacing w:lineRule="auto" w:line="240" w:before="20" w:after="0"/>
-              <w:ind w:left="102" w:right="-20" w:hanging="0"/>
-              <w:rPr>
-                <w:b/>
+              <w:ind w:hanging="0" w:left="102" w:right="-20"/>
+              <w:rPr>
                 <w:b/>
               </w:rPr>
             </w:pPr>
@@ -6231,8 +6142,6 @@
               <w:left w:val="single" w:sz="4" w:space="0" w:color="000000"/>
               <w:bottom w:val="single" w:sz="8" w:space="0" w:color="000000"/>
               <w:right w:val="single" w:sz="4" w:space="0" w:color="000000"/>
-              <w:insideH w:val="single" w:sz="8" w:space="0" w:color="000000"/>
-              <w:insideV w:val="single" w:sz="4" w:space="0" w:color="000000"/>
             </w:tcBorders>
             <w:shd w:fill="auto" w:val="clear"/>
           </w:tcPr>
@@ -6241,7 +6150,7 @@
               <w:pStyle w:val="Normal"/>
               <w:widowControl w:val="false"/>
               <w:spacing w:lineRule="auto" w:line="240" w:before="17" w:after="0"/>
-              <w:ind w:left="102" w:right="-20" w:hanging="0"/>
+              <w:ind w:hanging="0" w:left="102" w:right="-20"/>
               <w:rPr/>
             </w:pPr>
             <w:r>
@@ -6719,7 +6628,7 @@
             <w:pPr>
               <w:pStyle w:val="Normal"/>
               <w:spacing w:lineRule="auto" w:line="240" w:before="0" w:after="0"/>
-              <w:ind w:left="360" w:hanging="0"/>
+              <w:ind w:hanging="0" w:left="360"/>
               <w:rPr/>
             </w:pPr>
             <w:r>
@@ -6732,7 +6641,7 @@
               <w:pStyle w:val="Normal"/>
               <w:widowControl w:val="false"/>
               <w:spacing w:lineRule="auto" w:line="240" w:before="17" w:after="0"/>
-              <w:ind w:right="-20" w:hanging="0"/>
+              <w:ind w:hanging="0" w:right="-20"/>
               <w:rPr/>
             </w:pPr>
             <w:r>
@@ -6754,8 +6663,6 @@
               <w:left w:val="single" w:sz="4" w:space="0" w:color="000000"/>
               <w:bottom w:val="single" w:sz="4" w:space="0" w:color="000000"/>
               <w:right w:val="single" w:sz="4" w:space="0" w:color="000000"/>
-              <w:insideH w:val="single" w:sz="4" w:space="0" w:color="000000"/>
-              <w:insideV w:val="single" w:sz="4" w:space="0" w:color="000000"/>
             </w:tcBorders>
             <w:shd w:fill="auto" w:val="clear"/>
           </w:tcPr>
@@ -6764,9 +6671,8 @@
               <w:pStyle w:val="Normal"/>
               <w:widowControl w:val="false"/>
               <w:spacing w:lineRule="auto" w:line="240" w:before="15" w:after="0"/>
-              <w:ind w:left="102" w:right="57" w:hanging="0"/>
-              <w:rPr>
-                <w:b/>
+              <w:ind w:hanging="0" w:left="102" w:right="57"/>
+              <w:rPr>
                 <w:b/>
               </w:rPr>
             </w:pPr>
@@ -6796,7 +6702,7 @@
         <w:pStyle w:val="Normal"/>
         <w:widowControl w:val="false"/>
         <w:spacing w:lineRule="auto" w:line="240" w:before="0" w:after="0"/>
-        <w:ind w:right="78" w:hanging="0"/>
+        <w:ind w:hanging="0" w:right="78"/>
         <w:rPr/>
       </w:pPr>
       <w:r>
@@ -8202,7 +8108,6 @@
         <w:spacing w:lineRule="auto" w:line="240" w:before="0" w:after="0"/>
         <w:rPr>
           <w:rFonts w:cs="Arial"/>
-          <w:b/>
           <w:b/>
           <w:sz w:val="24"/>
           <w:szCs w:val="24"/>
@@ -8287,7 +8192,7 @@
           <w:tab w:val="left" w:pos="-1440" w:leader="none"/>
         </w:tabs>
         <w:spacing w:lineRule="auto" w:line="240" w:before="0" w:after="0"/>
-        <w:ind w:left="810" w:hanging="810"/>
+        <w:ind w:hanging="810" w:left="810"/>
         <w:rPr/>
       </w:pPr>
       <w:r>
@@ -8301,11 +8206,15 @@
       </w:r>
     </w:p>
     <w:sectPr>
-      <w:headerReference w:type="default" r:id="rId2"/>
-      <w:footerReference w:type="default" r:id="rId3"/>
+      <w:headerReference w:type="even" r:id="rId2"/>
+      <w:headerReference w:type="default" r:id="rId3"/>
+      <w:headerReference w:type="first" r:id="rId4"/>
+      <w:footerReference w:type="even" r:id="rId5"/>
+      <w:footerReference w:type="default" r:id="rId6"/>
+      <w:footerReference w:type="first" r:id="rId7"/>
       <w:type w:val="nextPage"/>
       <w:pgSz w:w="12240" w:h="15840"/>
-      <w:pgMar w:left="1440" w:right="1440" w:header="720" w:top="1440" w:footer="720" w:bottom="1440" w:gutter="0"/>
+      <w:pgMar w:left="1440" w:right="1440" w:gutter="0" w:header="720" w:top="1440" w:footer="720" w:bottom="1440"/>
       <w:pgNumType w:start="1" w:fmt="decimal"/>
       <w:formProt w:val="false"/>
       <w:textDirection w:val="lrTb"/>
@@ -8316,7 +8225,21 @@
 </file>
 
 <file path=word/footer1.xml><?xml version="1.0" encoding="utf-8"?>
-<w:ftr xmlns:o="urn:schemas-microsoft-com:office:office" xmlns:r="http://schemas.openxmlformats.org/officeDocument/2006/relationships" xmlns:v="urn:schemas-microsoft-com:vml" xmlns:w="http://schemas.openxmlformats.org/wordprocessingml/2006/main" xmlns:w10="urn:schemas-microsoft-com:office:word" xmlns:wp="http://schemas.openxmlformats.org/drawingml/2006/wordprocessingDrawing" xmlns:wps="http://schemas.microsoft.com/office/word/2010/wordprocessingShape" xmlns:wpg="http://schemas.microsoft.com/office/word/2010/wordprocessingGroup" xmlns:mc="http://schemas.openxmlformats.org/markup-compatibility/2006" xmlns:wp14="http://schemas.microsoft.com/office/word/2010/wordprocessingDrawing" xmlns:w14="http://schemas.microsoft.com/office/word/2010/wordml" mc:Ignorable="w14 wp14">
+<w:ftr xmlns:o="urn:schemas-microsoft-com:office:office" xmlns:r="http://schemas.openxmlformats.org/officeDocument/2006/relationships" xmlns:v="urn:schemas-microsoft-com:vml" xmlns:w="http://schemas.openxmlformats.org/wordprocessingml/2006/main" xmlns:w10="urn:schemas-microsoft-com:office:word" xmlns:wp="http://schemas.openxmlformats.org/drawingml/2006/wordprocessingDrawing" xmlns:wps="http://schemas.microsoft.com/office/word/2010/wordprocessingShape" xmlns:wpg="http://schemas.microsoft.com/office/word/2010/wordprocessingGroup" xmlns:mc="http://schemas.openxmlformats.org/markup-compatibility/2006" xmlns:wp14="http://schemas.microsoft.com/office/word/2010/wordprocessingDrawing" xmlns:w14="http://schemas.microsoft.com/office/word/2010/wordml" xmlns:w15="http://schemas.microsoft.com/office/word/2012/wordml" mc:Ignorable="w14 wp14 w15">
+  <w:p>
+    <w:pPr>
+      <w:pStyle w:val="Footer"/>
+      <w:rPr/>
+    </w:pPr>
+    <w:r>
+      <w:rPr/>
+    </w:r>
+  </w:p>
+</w:ftr>
+</file>
+
+<file path=word/footer2.xml><?xml version="1.0" encoding="utf-8"?>
+<w:ftr xmlns:o="urn:schemas-microsoft-com:office:office" xmlns:r="http://schemas.openxmlformats.org/officeDocument/2006/relationships" xmlns:v="urn:schemas-microsoft-com:vml" xmlns:w="http://schemas.openxmlformats.org/wordprocessingml/2006/main" xmlns:w10="urn:schemas-microsoft-com:office:word" xmlns:wp="http://schemas.openxmlformats.org/drawingml/2006/wordprocessingDrawing" xmlns:wps="http://schemas.microsoft.com/office/word/2010/wordprocessingShape" xmlns:wpg="http://schemas.microsoft.com/office/word/2010/wordprocessingGroup" xmlns:mc="http://schemas.openxmlformats.org/markup-compatibility/2006" xmlns:wp14="http://schemas.microsoft.com/office/word/2010/wordprocessingDrawing" xmlns:w14="http://schemas.microsoft.com/office/word/2010/wordml" xmlns:w15="http://schemas.microsoft.com/office/word/2012/wordml" mc:Ignorable="w14 wp14 w15">
   <w:p>
     <w:pPr>
       <w:pStyle w:val="Footer"/>
@@ -8329,7 +8252,48 @@
     </w:r>
     <w:r>
       <w:rPr/>
-      <w:instrText> PAGE </w:instrText>
+      <w:instrText xml:space="preserve"> PAGE </w:instrText>
+    </w:r>
+    <w:r>
+      <w:rPr/>
+      <w:fldChar w:fldCharType="separate"/>
+    </w:r>
+    <w:r>
+      <w:rPr/>
+      <w:t>5</w:t>
+    </w:r>
+    <w:r>
+      <w:rPr/>
+      <w:fldChar w:fldCharType="end"/>
+    </w:r>
+  </w:p>
+  <w:p>
+    <w:pPr>
+      <w:pStyle w:val="Footer"/>
+      <w:rPr/>
+    </w:pPr>
+    <w:r>
+      <w:rPr/>
+    </w:r>
+  </w:p>
+</w:ftr>
+</file>
+
+<file path=word/footer3.xml><?xml version="1.0" encoding="utf-8"?>
+<w:ftr xmlns:o="urn:schemas-microsoft-com:office:office" xmlns:r="http://schemas.openxmlformats.org/officeDocument/2006/relationships" xmlns:v="urn:schemas-microsoft-com:vml" xmlns:w="http://schemas.openxmlformats.org/wordprocessingml/2006/main" xmlns:w10="urn:schemas-microsoft-com:office:word" xmlns:wp="http://schemas.openxmlformats.org/drawingml/2006/wordprocessingDrawing" xmlns:wps="http://schemas.microsoft.com/office/word/2010/wordprocessingShape" xmlns:wpg="http://schemas.microsoft.com/office/word/2010/wordprocessingGroup" xmlns:mc="http://schemas.openxmlformats.org/markup-compatibility/2006" xmlns:wp14="http://schemas.microsoft.com/office/word/2010/wordprocessingDrawing" xmlns:w14="http://schemas.microsoft.com/office/word/2010/wordml" xmlns:w15="http://schemas.microsoft.com/office/word/2012/wordml" mc:Ignorable="w14 wp14 w15">
+  <w:p>
+    <w:pPr>
+      <w:pStyle w:val="Footer"/>
+      <w:jc w:val="center"/>
+      <w:rPr/>
+    </w:pPr>
+    <w:r>
+      <w:rPr/>
+      <w:fldChar w:fldCharType="begin"/>
+    </w:r>
+    <w:r>
+      <w:rPr/>
+      <w:instrText xml:space="preserve"> PAGE </w:instrText>
     </w:r>
     <w:r>
       <w:rPr/>
@@ -8357,7 +8321,35 @@
 </file>
 
 <file path=word/header1.xml><?xml version="1.0" encoding="utf-8"?>
-<w:hdr xmlns:o="urn:schemas-microsoft-com:office:office" xmlns:r="http://schemas.openxmlformats.org/officeDocument/2006/relationships" xmlns:v="urn:schemas-microsoft-com:vml" xmlns:w="http://schemas.openxmlformats.org/wordprocessingml/2006/main" xmlns:w10="urn:schemas-microsoft-com:office:word" xmlns:wp="http://schemas.openxmlformats.org/drawingml/2006/wordprocessingDrawing" xmlns:wps="http://schemas.microsoft.com/office/word/2010/wordprocessingShape" xmlns:wpg="http://schemas.microsoft.com/office/word/2010/wordprocessingGroup" xmlns:mc="http://schemas.openxmlformats.org/markup-compatibility/2006" xmlns:wp14="http://schemas.microsoft.com/office/word/2010/wordprocessingDrawing" xmlns:w14="http://schemas.microsoft.com/office/word/2010/wordml" mc:Ignorable="w14 wp14">
+<w:hdr xmlns:o="urn:schemas-microsoft-com:office:office" xmlns:r="http://schemas.openxmlformats.org/officeDocument/2006/relationships" xmlns:v="urn:schemas-microsoft-com:vml" xmlns:w="http://schemas.openxmlformats.org/wordprocessingml/2006/main" xmlns:w10="urn:schemas-microsoft-com:office:word" xmlns:wp="http://schemas.openxmlformats.org/drawingml/2006/wordprocessingDrawing" xmlns:wps="http://schemas.microsoft.com/office/word/2010/wordprocessingShape" xmlns:wpg="http://schemas.microsoft.com/office/word/2010/wordprocessingGroup" xmlns:mc="http://schemas.openxmlformats.org/markup-compatibility/2006" xmlns:wp14="http://schemas.microsoft.com/office/word/2010/wordprocessingDrawing" xmlns:w14="http://schemas.microsoft.com/office/word/2010/wordml" xmlns:w15="http://schemas.microsoft.com/office/word/2012/wordml" mc:Ignorable="w14 wp14 w15">
+  <w:p>
+    <w:pPr>
+      <w:pStyle w:val="Header"/>
+      <w:rPr/>
+    </w:pPr>
+    <w:r>
+      <w:rPr/>
+    </w:r>
+  </w:p>
+</w:hdr>
+</file>
+
+<file path=word/header2.xml><?xml version="1.0" encoding="utf-8"?>
+<w:hdr xmlns:o="urn:schemas-microsoft-com:office:office" xmlns:r="http://schemas.openxmlformats.org/officeDocument/2006/relationships" xmlns:v="urn:schemas-microsoft-com:vml" xmlns:w="http://schemas.openxmlformats.org/wordprocessingml/2006/main" xmlns:w10="urn:schemas-microsoft-com:office:word" xmlns:wp="http://schemas.openxmlformats.org/drawingml/2006/wordprocessingDrawing" xmlns:wps="http://schemas.microsoft.com/office/word/2010/wordprocessingShape" xmlns:wpg="http://schemas.microsoft.com/office/word/2010/wordprocessingGroup" xmlns:mc="http://schemas.openxmlformats.org/markup-compatibility/2006" xmlns:wp14="http://schemas.microsoft.com/office/word/2010/wordprocessingDrawing" xmlns:w14="http://schemas.microsoft.com/office/word/2010/wordml" xmlns:w15="http://schemas.microsoft.com/office/word/2012/wordml" mc:Ignorable="w14 wp14 w15">
+  <w:p>
+    <w:pPr>
+      <w:pStyle w:val="Header"/>
+      <w:rPr/>
+    </w:pPr>
+    <w:r>
+      <w:rPr/>
+    </w:r>
+  </w:p>
+</w:hdr>
+</file>
+
+<file path=word/header3.xml><?xml version="1.0" encoding="utf-8"?>
+<w:hdr xmlns:o="urn:schemas-microsoft-com:office:office" xmlns:r="http://schemas.openxmlformats.org/officeDocument/2006/relationships" xmlns:v="urn:schemas-microsoft-com:vml" xmlns:w="http://schemas.openxmlformats.org/wordprocessingml/2006/main" xmlns:w10="urn:schemas-microsoft-com:office:word" xmlns:wp="http://schemas.openxmlformats.org/drawingml/2006/wordprocessingDrawing" xmlns:wps="http://schemas.microsoft.com/office/word/2010/wordprocessingShape" xmlns:wpg="http://schemas.microsoft.com/office/word/2010/wordprocessingGroup" xmlns:mc="http://schemas.openxmlformats.org/markup-compatibility/2006" xmlns:wp14="http://schemas.microsoft.com/office/word/2010/wordprocessingDrawing" xmlns:w14="http://schemas.microsoft.com/office/word/2010/wordml" xmlns:w15="http://schemas.microsoft.com/office/word/2012/wordml" mc:Ignorable="w14 wp14 w15">
   <w:p>
     <w:pPr>
       <w:pStyle w:val="Header"/>
@@ -8371,7 +8363,7 @@
 </file>
 
 <file path=word/numbering.xml><?xml version="1.0" encoding="utf-8"?>
-<w:numbering xmlns:w="http://schemas.openxmlformats.org/wordprocessingml/2006/main" xmlns:o="urn:schemas-microsoft-com:office:office" xmlns:r="http://schemas.openxmlformats.org/officeDocument/2006/relationships" xmlns:v="urn:schemas-microsoft-com:vml">
+<w:numbering xmlns:w="http://schemas.openxmlformats.org/wordprocessingml/2006/main" xmlns:o="urn:schemas-microsoft-com:office:office" xmlns:r="http://schemas.openxmlformats.org/officeDocument/2006/relationships" xmlns:v="urn:schemas-microsoft-com:vml" xmlns:mc="http://schemas.openxmlformats.org/markup-compatibility/2006" xmlns:w14="http://schemas.microsoft.com/office/word/2010/wordml" mc:Ignorable="w14">
   <w:abstractNum w:abstractNumId="1">
     <w:lvl w:ilvl="0">
       <w:start w:val="1"/>
@@ -8379,6 +8371,9 @@
       <w:lvlText w:val="%1."/>
       <w:lvlJc w:val="left"/>
       <w:pPr>
+        <w:tabs>
+          <w:tab w:val="num" w:pos="0"/>
+        </w:tabs>
         <w:ind w:left="360" w:hanging="360"/>
       </w:pPr>
       <w:rPr>
@@ -8392,8 +8387,12 @@
       <w:lvlText w:val="%2."/>
       <w:lvlJc w:val="left"/>
       <w:pPr>
+        <w:tabs>
+          <w:tab w:val="num" w:pos="0"/>
+        </w:tabs>
         <w:ind w:left="1080" w:hanging="360"/>
       </w:pPr>
+      <w:rPr/>
     </w:lvl>
     <w:lvl w:ilvl="2">
       <w:start w:val="1"/>
@@ -8401,8 +8400,12 @@
       <w:lvlText w:val="%3."/>
       <w:lvlJc w:val="right"/>
       <w:pPr>
+        <w:tabs>
+          <w:tab w:val="num" w:pos="0"/>
+        </w:tabs>
         <w:ind w:left="1800" w:hanging="180"/>
       </w:pPr>
+      <w:rPr/>
     </w:lvl>
     <w:lvl w:ilvl="3">
       <w:start w:val="1"/>
@@ -8410,8 +8413,12 @@
       <w:lvlText w:val="%4."/>
       <w:lvlJc w:val="left"/>
       <w:pPr>
+        <w:tabs>
+          <w:tab w:val="num" w:pos="0"/>
+        </w:tabs>
         <w:ind w:left="2520" w:hanging="360"/>
       </w:pPr>
+      <w:rPr/>
     </w:lvl>
     <w:lvl w:ilvl="4">
       <w:start w:val="1"/>
@@ -8419,8 +8426,12 @@
       <w:lvlText w:val="%5."/>
       <w:lvlJc w:val="left"/>
       <w:pPr>
+        <w:tabs>
+          <w:tab w:val="num" w:pos="0"/>
+        </w:tabs>
         <w:ind w:left="3240" w:hanging="360"/>
       </w:pPr>
+      <w:rPr/>
     </w:lvl>
     <w:lvl w:ilvl="5">
       <w:start w:val="1"/>
@@ -8428,8 +8439,12 @@
       <w:lvlText w:val="%6."/>
       <w:lvlJc w:val="right"/>
       <w:pPr>
+        <w:tabs>
+          <w:tab w:val="num" w:pos="0"/>
+        </w:tabs>
         <w:ind w:left="3960" w:hanging="180"/>
       </w:pPr>
+      <w:rPr/>
     </w:lvl>
     <w:lvl w:ilvl="6">
       <w:start w:val="1"/>
@@ -8437,8 +8452,12 @@
       <w:lvlText w:val="%7."/>
       <w:lvlJc w:val="left"/>
       <w:pPr>
+        <w:tabs>
+          <w:tab w:val="num" w:pos="0"/>
+        </w:tabs>
         <w:ind w:left="4680" w:hanging="360"/>
       </w:pPr>
+      <w:rPr/>
     </w:lvl>
     <w:lvl w:ilvl="7">
       <w:start w:val="1"/>
@@ -8446,8 +8465,12 @@
       <w:lvlText w:val="%8."/>
       <w:lvlJc w:val="left"/>
       <w:pPr>
+        <w:tabs>
+          <w:tab w:val="num" w:pos="0"/>
+        </w:tabs>
         <w:ind w:left="5400" w:hanging="360"/>
       </w:pPr>
+      <w:rPr/>
     </w:lvl>
     <w:lvl w:ilvl="8">
       <w:start w:val="1"/>
@@ -8455,8 +8478,12 @@
       <w:lvlText w:val="%9."/>
       <w:lvlJc w:val="right"/>
       <w:pPr>
+        <w:tabs>
+          <w:tab w:val="num" w:pos="0"/>
+        </w:tabs>
         <w:ind w:left="6120" w:hanging="180"/>
       </w:pPr>
+      <w:rPr/>
     </w:lvl>
   </w:abstractNum>
   <w:abstractNum w:abstractNumId="2">
@@ -8467,6 +8494,9 @@
       <w:lvlText w:val=""/>
       <w:lvlJc w:val="left"/>
       <w:pPr>
+        <w:tabs>
+          <w:tab w:val="num" w:pos="0"/>
+        </w:tabs>
         <w:ind w:left="0" w:hanging="0"/>
       </w:pPr>
     </w:lvl>
@@ -8477,6 +8507,9 @@
       <w:lvlText w:val=""/>
       <w:lvlJc w:val="left"/>
       <w:pPr>
+        <w:tabs>
+          <w:tab w:val="num" w:pos="0"/>
+        </w:tabs>
         <w:ind w:left="0" w:hanging="0"/>
       </w:pPr>
     </w:lvl>
@@ -8487,6 +8520,9 @@
       <w:lvlText w:val=""/>
       <w:lvlJc w:val="left"/>
       <w:pPr>
+        <w:tabs>
+          <w:tab w:val="num" w:pos="0"/>
+        </w:tabs>
         <w:ind w:left="0" w:hanging="0"/>
       </w:pPr>
     </w:lvl>
@@ -8497,6 +8533,9 @@
       <w:lvlText w:val=""/>
       <w:lvlJc w:val="left"/>
       <w:pPr>
+        <w:tabs>
+          <w:tab w:val="num" w:pos="0"/>
+        </w:tabs>
         <w:ind w:left="0" w:hanging="0"/>
       </w:pPr>
     </w:lvl>
@@ -8507,6 +8546,9 @@
       <w:lvlText w:val=""/>
       <w:lvlJc w:val="left"/>
       <w:pPr>
+        <w:tabs>
+          <w:tab w:val="num" w:pos="0"/>
+        </w:tabs>
         <w:ind w:left="0" w:hanging="0"/>
       </w:pPr>
     </w:lvl>
@@ -8517,6 +8559,9 @@
       <w:lvlText w:val=""/>
       <w:lvlJc w:val="left"/>
       <w:pPr>
+        <w:tabs>
+          <w:tab w:val="num" w:pos="0"/>
+        </w:tabs>
         <w:ind w:left="0" w:hanging="0"/>
       </w:pPr>
     </w:lvl>
@@ -8527,6 +8572,9 @@
       <w:lvlText w:val=""/>
       <w:lvlJc w:val="left"/>
       <w:pPr>
+        <w:tabs>
+          <w:tab w:val="num" w:pos="0"/>
+        </w:tabs>
         <w:ind w:left="0" w:hanging="0"/>
       </w:pPr>
     </w:lvl>
@@ -8537,6 +8585,9 @@
       <w:lvlText w:val=""/>
       <w:lvlJc w:val="left"/>
       <w:pPr>
+        <w:tabs>
+          <w:tab w:val="num" w:pos="0"/>
+        </w:tabs>
         <w:ind w:left="0" w:hanging="0"/>
       </w:pPr>
     </w:lvl>
@@ -8547,6 +8598,9 @@
       <w:lvlText w:val=""/>
       <w:lvlJc w:val="left"/>
       <w:pPr>
+        <w:tabs>
+          <w:tab w:val="num" w:pos="0"/>
+        </w:tabs>
         <w:ind w:left="0" w:hanging="0"/>
       </w:pPr>
     </w:lvl>
@@ -8570,7 +8624,9 @@
       </w:rPr>
     </w:rPrDefault>
     <w:pPrDefault>
-      <w:pPr/>
+      <w:pPr>
+        <w:suppressAutoHyphens w:val="true"/>
+      </w:pPr>
     </w:pPrDefault>
   </w:docDefaults>
   <w:latentStyles w:defLockedState="0" w:defUIPriority="99" w:defSemiHidden="0" w:defUnhideWhenUsed="0" w:defQFormat="0" w:count="371">
@@ -9002,18 +9058,10 @@
       <w:szCs w:val="22"/>
     </w:rPr>
   </w:style>
-  <w:style w:type="character" w:styleId="ListLabel1">
-    <w:name w:val="ListLabel 1"/>
-    <w:qFormat/>
-    <w:rPr>
-      <w:b/>
-      <w:sz w:val="24"/>
-    </w:rPr>
-  </w:style>
   <w:style w:type="paragraph" w:styleId="Heading">
     <w:name w:val="Heading"/>
     <w:basedOn w:val="Normal"/>
-    <w:next w:val="TextBody"/>
+    <w:next w:val="BodyText"/>
     <w:qFormat/>
     <w:pPr>
       <w:keepNext w:val="true"/>
@@ -9025,7 +9073,7 @@
       <w:szCs w:val="28"/>
     </w:rPr>
   </w:style>
-  <w:style w:type="paragraph" w:styleId="TextBody">
+  <w:style w:type="paragraph" w:styleId="BodyText">
     <w:name w:val="Body Text"/>
     <w:basedOn w:val="Normal"/>
     <w:pPr>
@@ -9035,14 +9083,14 @@
   </w:style>
   <w:style w:type="paragraph" w:styleId="List">
     <w:name w:val="List"/>
-    <w:basedOn w:val="TextBody"/>
+    <w:basedOn w:val="BodyText"/>
     <w:pPr/>
     <w:rPr>
       <w:rFonts w:cs="Noto Sans Devanagari"/>
     </w:rPr>
   </w:style>
   <w:style w:type="paragraph" w:styleId="Caption">
-    <w:name w:val="Caption"/>
+    <w:name w:val="caption"/>
     <w:basedOn w:val="Normal"/>
     <w:qFormat/>
     <w:pPr>
@@ -9074,6 +9122,7 @@
     <w:pPr>
       <w:widowControl/>
       <w:bidi w:val="0"/>
+      <w:spacing w:before="0" w:after="0"/>
       <w:jc w:val="left"/>
     </w:pPr>
     <w:rPr>
@@ -9112,12 +9161,19 @@
     <w:basedOn w:val="Normal"/>
     <w:qFormat/>
     <w:pPr>
-      <w:ind w:left="720" w:hanging="0"/>
+      <w:ind w:hanging="0" w:left="720"/>
     </w:pPr>
     <w:rPr/>
   </w:style>
+  <w:style w:type="paragraph" w:styleId="HeaderandFooter">
+    <w:name w:val="Header and Footer"/>
+    <w:basedOn w:val="Normal"/>
+    <w:qFormat/>
+    <w:pPr/>
+    <w:rPr/>
+  </w:style>
   <w:style w:type="paragraph" w:styleId="Header">
-    <w:name w:val="Header"/>
+    <w:name w:val="header"/>
     <w:basedOn w:val="Normal"/>
     <w:pPr>
       <w:tabs>
@@ -9130,7 +9186,7 @@
     <w:rPr/>
   </w:style>
   <w:style w:type="paragraph" w:styleId="Footer">
-    <w:name w:val="Footer"/>
+    <w:name w:val="footer"/>
     <w:basedOn w:val="Normal"/>
     <w:pPr>
       <w:tabs>
@@ -9149,11 +9205,12 @@
     <w:pPr>
       <w:widowControl/>
       <w:bidi w:val="0"/>
+      <w:spacing w:before="0" w:after="0"/>
       <w:jc w:val="left"/>
       <w:textAlignment w:val="auto"/>
     </w:pPr>
     <w:rPr>
-      <w:rFonts w:ascii="Arial" w:hAnsi="Arial" w:cs="Arial" w:eastAsia="Times New Roman"/>
+      <w:rFonts w:ascii="Arial" w:hAnsi="Arial" w:eastAsia="Times New Roman" w:cs="Arial"/>
       <w:color w:val="000000"/>
       <w:kern w:val="0"/>
       <w:sz w:val="24"/>
@@ -9174,7 +9231,6 @@
     <w:semiHidden/>
     <w:unhideWhenUsed/>
     <w:tblPr>
-      <w:tblInd w:w="0" w:type="dxa"/>
       <w:tblCellMar>
         <w:top w:w="0" w:type="dxa"/>
         <w:left w:w="108" w:type="dxa"/>
@@ -9203,161 +9259,97 @@
 </file>
 
 <file path=word/theme/theme1.xml><?xml version="1.0" encoding="utf-8"?>
-<a:theme xmlns:a="http://schemas.openxmlformats.org/drawingml/2006/main" name="Office Theme">
+<a:theme xmlns:a="http://schemas.openxmlformats.org/drawingml/2006/main" xmlns:r="http://schemas.openxmlformats.org/officeDocument/2006/relationships" name="Office Theme">
   <a:themeElements>
     <a:clrScheme name="Office">
       <a:dk1>
-        <a:sysClr val="windowText" lastClr="000000"/>
+        <a:srgbClr val="000000"/>
       </a:dk1>
       <a:lt1>
-        <a:sysClr val="window" lastClr="FFFFFF"/>
+        <a:srgbClr val="ffffff"/>
       </a:lt1>
       <a:dk2>
-        <a:srgbClr val="44546A"/>
+        <a:srgbClr val="44546a"/>
       </a:dk2>
       <a:lt2>
-        <a:srgbClr val="E7E6E6"/>
+        <a:srgbClr val="e7e6e6"/>
       </a:lt2>
       <a:accent1>
-        <a:srgbClr val="5B9BD5"/>
+        <a:srgbClr val="5b9bd5"/>
       </a:accent1>
       <a:accent2>
-        <a:srgbClr val="ED7D31"/>
+        <a:srgbClr val="ed7d31"/>
       </a:accent2>
       <a:accent3>
-        <a:srgbClr val="A5A5A5"/>
+        <a:srgbClr val="a5a5a5"/>
       </a:accent3>
       <a:accent4>
-        <a:srgbClr val="FFC000"/>
+        <a:srgbClr val="ffc000"/>
       </a:accent4>
       <a:accent5>
-        <a:srgbClr val="4472C4"/>
+        <a:srgbClr val="4472c4"/>
       </a:accent5>
       <a:accent6>
-        <a:srgbClr val="70AD47"/>
+        <a:srgbClr val="70ad47"/>
       </a:accent6>
       <a:hlink>
-        <a:srgbClr val="0563C1"/>
+        <a:srgbClr val="0563c1"/>
       </a:hlink>
       <a:folHlink>
-        <a:srgbClr val="954F72"/>
+        <a:srgbClr val="954f72"/>
       </a:folHlink>
     </a:clrScheme>
     <a:fontScheme name="Office">
       <a:majorFont>
-        <a:latin typeface="Calibri Light" panose="020F0302020204030204"/>
+        <a:latin typeface="Calibri Light" panose="020F0302020204030204" pitchFamily="0" charset="1"/>
         <a:ea typeface=""/>
         <a:cs typeface=""/>
-        <a:font script="Jpan" typeface="ＭＳ ゴシック"/>
-        <a:font script="Hang" typeface="맑은 고딕"/>
-        <a:font script="Hans" typeface="宋体"/>
-        <a:font script="Hant" typeface="新細明體"/>
-        <a:font script="Arab" typeface="Times New Roman"/>
-        <a:font script="Hebr" typeface="Times New Roman"/>
-        <a:font script="Thai" typeface="Angsana New"/>
-        <a:font script="Ethi" typeface="Nyala"/>
-        <a:font script="Beng" typeface="Vrinda"/>
-        <a:font script="Gujr" typeface="Shruti"/>
-        <a:font script="Khmr" typeface="MoolBoran"/>
-        <a:font script="Knda" typeface="Tunga"/>
-        <a:font script="Guru" typeface="Raavi"/>
-        <a:font script="Cans" typeface="Euphemia"/>
-        <a:font script="Cher" typeface="Plantagenet Cherokee"/>
-        <a:font script="Yiii" typeface="Microsoft Yi Baiti"/>
-        <a:font script="Tibt" typeface="Microsoft Himalaya"/>
-        <a:font script="Thaa" typeface="MV Boli"/>
-        <a:font script="Deva" typeface="Mangal"/>
-        <a:font script="Telu" typeface="Gautami"/>
-        <a:font script="Taml" typeface="Latha"/>
-        <a:font script="Syrc" typeface="Estrangelo Edessa"/>
-        <a:font script="Orya" typeface="Kalinga"/>
-        <a:font script="Mlym" typeface="Kartika"/>
-        <a:font script="Laoo" typeface="DokChampa"/>
-        <a:font script="Sinh" typeface="Iskoola Pota"/>
-        <a:font script="Mong" typeface="Mongolian Baiti"/>
-        <a:font script="Viet" typeface="Times New Roman"/>
-        <a:font script="Uigh" typeface="Microsoft Uighur"/>
-        <a:font script="Geor" typeface="Sylfaen"/>
       </a:majorFont>
       <a:minorFont>
-        <a:latin typeface="Calibri" panose="020F0502020204030204"/>
+        <a:latin typeface="Calibri" panose="020F0502020204030204" pitchFamily="0" charset="1"/>
         <a:ea typeface=""/>
         <a:cs typeface=""/>
-        <a:font script="Jpan" typeface="ＭＳ 明朝"/>
-        <a:font script="Hang" typeface="맑은 고딕"/>
-        <a:font script="Hans" typeface="宋体"/>
-        <a:font script="Hant" typeface="新細明體"/>
-        <a:font script="Arab" typeface="Arial"/>
-        <a:font script="Hebr" typeface="Arial"/>
-        <a:font script="Thai" typeface="Cordia New"/>
-        <a:font script="Ethi" typeface="Nyala"/>
-        <a:font script="Beng" typeface="Vrinda"/>
-        <a:font script="Gujr" typeface="Shruti"/>
-        <a:font script="Khmr" typeface="DaunPenh"/>
-        <a:font script="Knda" typeface="Tunga"/>
-        <a:font script="Guru" typeface="Raavi"/>
-        <a:font script="Cans" typeface="Euphemia"/>
-        <a:font script="Cher" typeface="Plantagenet Cherokee"/>
-        <a:font script="Yiii" typeface="Microsoft Yi Baiti"/>
-        <a:font script="Tibt" typeface="Microsoft Himalaya"/>
-        <a:font script="Thaa" typeface="MV Boli"/>
-        <a:font script="Deva" typeface="Mangal"/>
-        <a:font script="Telu" typeface="Gautami"/>
-        <a:font script="Taml" typeface="Latha"/>
-        <a:font script="Syrc" typeface="Estrangelo Edessa"/>
-        <a:font script="Orya" typeface="Kalinga"/>
-        <a:font script="Mlym" typeface="Kartika"/>
-        <a:font script="Laoo" typeface="DokChampa"/>
-        <a:font script="Sinh" typeface="Iskoola Pota"/>
-        <a:font script="Mong" typeface="Mongolian Baiti"/>
-        <a:font script="Viet" typeface="Arial"/>
-        <a:font script="Uigh" typeface="Microsoft Uighur"/>
-        <a:font script="Geor" typeface="Sylfaen"/>
       </a:minorFont>
     </a:fontScheme>
-    <a:fmtScheme name="Office">
+    <a:fmtScheme>
       <a:fillStyleLst>
         <a:solidFill>
           <a:schemeClr val="phClr"/>
         </a:solidFill>
-        <a:gradFill rotWithShape="1">
+        <a:gradFill>
           <a:gsLst>
             <a:gs pos="0">
               <a:schemeClr val="phClr">
                 <a:lumMod val="110000"/>
-                <a:satMod val="105000"/>
                 <a:tint val="67000"/>
               </a:schemeClr>
             </a:gs>
             <a:gs pos="50000">
               <a:schemeClr val="phClr">
                 <a:lumMod val="105000"/>
-                <a:satMod val="103000"/>
                 <a:tint val="73000"/>
               </a:schemeClr>
             </a:gs>
             <a:gs pos="100000">
               <a:schemeClr val="phClr">
                 <a:lumMod val="105000"/>
-                <a:satMod val="109000"/>
                 <a:tint val="81000"/>
               </a:schemeClr>
             </a:gs>
           </a:gsLst>
           <a:lin ang="5400000" scaled="0"/>
+          <a:tileRect l="0" t="0" r="0" b="0"/>
         </a:gradFill>
-        <a:gradFill rotWithShape="1">
+        <a:gradFill>
           <a:gsLst>
             <a:gs pos="0">
               <a:schemeClr val="phClr">
-                <a:satMod val="103000"/>
                 <a:lumMod val="102000"/>
                 <a:tint val="94000"/>
               </a:schemeClr>
             </a:gs>
             <a:gs pos="50000">
               <a:schemeClr val="phClr">
-                <a:satMod val="110000"/>
                 <a:lumMod val="100000"/>
                 <a:shade val="100000"/>
               </a:schemeClr>
@@ -9365,33 +9357,24 @@
             <a:gs pos="100000">
               <a:schemeClr val="phClr">
                 <a:lumMod val="99000"/>
-                <a:satMod val="120000"/>
                 <a:shade val="78000"/>
               </a:schemeClr>
             </a:gs>
           </a:gsLst>
           <a:lin ang="5400000" scaled="0"/>
+          <a:tileRect l="0" t="0" r="0" b="0"/>
         </a:gradFill>
       </a:fillStyleLst>
       <a:lnStyleLst>
         <a:ln w="6350" cap="flat" cmpd="sng" algn="ctr">
-          <a:solidFill>
-            <a:schemeClr val="phClr"/>
-          </a:solidFill>
           <a:prstDash val="solid"/>
           <a:miter lim="800000"/>
         </a:ln>
         <a:ln w="12700" cap="flat" cmpd="sng" algn="ctr">
-          <a:solidFill>
-            <a:schemeClr val="phClr"/>
-          </a:solidFill>
           <a:prstDash val="solid"/>
           <a:miter lim="800000"/>
         </a:ln>
         <a:ln w="19050" cap="flat" cmpd="sng" algn="ctr">
-          <a:solidFill>
-            <a:schemeClr val="phClr"/>
-          </a:solidFill>
           <a:prstDash val="solid"/>
           <a:miter lim="800000"/>
         </a:ln>
@@ -9404,13 +9387,7 @@
           <a:effectLst/>
         </a:effectStyle>
         <a:effectStyle>
-          <a:effectLst>
-            <a:outerShdw blurRad="57150" dist="19050" dir="5400000" algn="ctr" rotWithShape="0">
-              <a:srgbClr val="000000">
-                <a:alpha val="63000"/>
-              </a:srgbClr>
-            </a:outerShdw>
-          </a:effectLst>
+          <a:effectLst/>
         </a:effectStyle>
       </a:effectStyleLst>
       <a:bgFillStyleLst>
@@ -9420,15 +9397,13 @@
         <a:solidFill>
           <a:schemeClr val="phClr">
             <a:tint val="95000"/>
-            <a:satMod val="170000"/>
           </a:schemeClr>
         </a:solidFill>
-        <a:gradFill rotWithShape="1">
+        <a:gradFill>
           <a:gsLst>
             <a:gs pos="0">
               <a:schemeClr val="phClr">
                 <a:tint val="93000"/>
-                <a:satMod val="150000"/>
                 <a:shade val="98000"/>
                 <a:lumMod val="102000"/>
               </a:schemeClr>
@@ -9436,7 +9411,6 @@
             <a:gs pos="50000">
               <a:schemeClr val="phClr">
                 <a:tint val="98000"/>
-                <a:satMod val="130000"/>
                 <a:shade val="90000"/>
                 <a:lumMod val="103000"/>
               </a:schemeClr>
@@ -9444,22 +9418,15 @@
             <a:gs pos="100000">
               <a:schemeClr val="phClr">
                 <a:shade val="63000"/>
-                <a:satMod val="120000"/>
               </a:schemeClr>
             </a:gs>
           </a:gsLst>
           <a:lin ang="5400000" scaled="0"/>
+          <a:tileRect l="0" t="0" r="0" b="0"/>
         </a:gradFill>
       </a:bgFillStyleLst>
     </a:fmtScheme>
   </a:themeElements>
-  <a:objectDefaults/>
-  <a:extraClrSchemeLst/>
-  <a:extLst>
-    <a:ext uri="{05A4C25C-085E-4340-85A3-A5531E510DB2}">
-      <thm15:themeFamily xmlns:thm15="http://schemas.microsoft.com/office/thememl/2012/main" name="Office Theme" id="{62F939B6-93AF-4DB8-9C6B-D6C7DFDC589F}" vid="{4A3C46E8-61CC-4603-A589-7422A47A8E4A}"/>
-    </a:ext>
-  </a:extLst>
 </a:theme>
 </file>
 

</xml_diff>